<commit_message>
Ansible - architecture updated
</commit_message>
<xml_diff>
--- a/Ansible/1-architecture.docx
+++ b/Ansible/1-architecture.docx
@@ -1,6 +1,6 @@
 
 <file path=word/document.xml><?xml version="1.0" encoding="utf-8"?>
-<w:document xmlns:wpc="http://schemas.microsoft.com/office/word/2010/wordprocessingCanvas" xmlns:cx="http://schemas.microsoft.com/office/drawing/2014/chartex" xmlns:cx1="http://schemas.microsoft.com/office/drawing/2015/9/8/chartex" xmlns:cx2="http://schemas.microsoft.com/office/drawing/2015/10/21/chartex" xmlns:cx3="http://schemas.microsoft.com/office/drawing/2016/5/9/chartex" xmlns:cx4="http://schemas.microsoft.com/office/drawing/2016/5/10/chartex" xmlns:cx5="http://schemas.microsoft.com/office/drawing/2016/5/11/chartex" xmlns:cx6="http://schemas.microsoft.com/office/drawing/2016/5/12/chartex" xmlns:cx7="http://schemas.microsoft.com/office/drawing/2016/5/13/chartex" xmlns:cx8="http://schemas.microsoft.com/office/drawing/2016/5/14/chartex" xmlns:mc="http://schemas.openxmlformats.org/markup-compatibility/2006" xmlns:aink="http://schemas.microsoft.com/office/drawing/2016/ink" xmlns:am3d="http://schemas.microsoft.com/office/drawing/2017/model3d" xmlns:o="urn:schemas-microsoft-com:office:office" xmlns:oel="http://schemas.microsoft.com/office/2019/extlst" xmlns:r="http://schemas.openxmlformats.org/officeDocument/2006/relationships" xmlns:m="http://schemas.openxmlformats.org/officeDocument/2006/math" xmlns:v="urn:schemas-microsoft-com:vml" xmlns:wp14="http://schemas.microsoft.com/office/word/2010/wordprocessingDrawing" xmlns:wp="http://schemas.openxmlformats.org/drawingml/2006/wordprocessingDrawing" xmlns:w10="urn:schemas-microsoft-com:office:word" xmlns:w="http://schemas.openxmlformats.org/wordprocessingml/2006/main" xmlns:w14="http://schemas.microsoft.com/office/word/2010/wordml" xmlns:w15="http://schemas.microsoft.com/office/word/2012/wordml" xmlns:w16cex="http://schemas.microsoft.com/office/word/2018/wordml/cex" xmlns:w16cid="http://schemas.microsoft.com/office/word/2016/wordml/cid" xmlns:w16="http://schemas.microsoft.com/office/word/2018/wordml" xmlns:w16sdtdh="http://schemas.microsoft.com/office/word/2020/wordml/sdtdatahash" xmlns:w16se="http://schemas.microsoft.com/office/word/2015/wordml/symex" xmlns:wpg="http://schemas.microsoft.com/office/word/2010/wordprocessingGroup" xmlns:wpi="http://schemas.microsoft.com/office/word/2010/wordprocessingInk" xmlns:wne="http://schemas.microsoft.com/office/word/2006/wordml" xmlns:wps="http://schemas.microsoft.com/office/word/2010/wordprocessingShape" mc:Ignorable="w14 w15 w16se w16cid w16 w16cex w16sdtdh wp14">
+<w:document xmlns:wpc="http://schemas.microsoft.com/office/word/2010/wordprocessingCanvas" xmlns:cx="http://schemas.microsoft.com/office/drawing/2014/chartex" xmlns:cx1="http://schemas.microsoft.com/office/drawing/2015/9/8/chartex" xmlns:cx2="http://schemas.microsoft.com/office/drawing/2015/10/21/chartex" xmlns:cx3="http://schemas.microsoft.com/office/drawing/2016/5/9/chartex" xmlns:cx4="http://schemas.microsoft.com/office/drawing/2016/5/10/chartex" xmlns:cx5="http://schemas.microsoft.com/office/drawing/2016/5/11/chartex" xmlns:cx6="http://schemas.microsoft.com/office/drawing/2016/5/12/chartex" xmlns:cx7="http://schemas.microsoft.com/office/drawing/2016/5/13/chartex" xmlns:cx8="http://schemas.microsoft.com/office/drawing/2016/5/14/chartex" xmlns:mc="http://schemas.openxmlformats.org/markup-compatibility/2006" xmlns:aink="http://schemas.microsoft.com/office/drawing/2016/ink" xmlns:am3d="http://schemas.microsoft.com/office/drawing/2017/model3d" xmlns:o="urn:schemas-microsoft-com:office:office" xmlns:oel="http://schemas.microsoft.com/office/2019/extlst" xmlns:r="http://schemas.openxmlformats.org/officeDocument/2006/relationships" xmlns:m="http://schemas.openxmlformats.org/officeDocument/2006/math" xmlns:v="urn:schemas-microsoft-com:vml" xmlns:wp14="http://schemas.microsoft.com/office/word/2010/wordprocessingDrawing" xmlns:wp="http://schemas.openxmlformats.org/drawingml/2006/wordprocessingDrawing" xmlns:w10="urn:schemas-microsoft-com:office:word" xmlns:w="http://schemas.openxmlformats.org/wordprocessingml/2006/main" xmlns:w14="http://schemas.microsoft.com/office/word/2010/wordml" xmlns:w15="http://schemas.microsoft.com/office/word/2012/wordml" xmlns:w16cex="http://schemas.microsoft.com/office/word/2018/wordml/cex" xmlns:w16cid="http://schemas.microsoft.com/office/word/2016/wordml/cid" xmlns:w16="http://schemas.microsoft.com/office/word/2018/wordml" xmlns:w16du="http://schemas.microsoft.com/office/word/2023/wordml/word16du" xmlns:w16sdtdh="http://schemas.microsoft.com/office/word/2020/wordml/sdtdatahash" xmlns:w16sdtfl="http://schemas.microsoft.com/office/word/2024/wordml/sdtformatlock" xmlns:w16se="http://schemas.microsoft.com/office/word/2015/wordml/symex" xmlns:wpg="http://schemas.microsoft.com/office/word/2010/wordprocessingGroup" xmlns:wpi="http://schemas.microsoft.com/office/word/2010/wordprocessingInk" xmlns:wne="http://schemas.microsoft.com/office/word/2006/wordml" xmlns:wps="http://schemas.microsoft.com/office/word/2010/wordprocessingShape" mc:Ignorable="w14 w15 w16se w16cid w16 w16cex w16sdtdh w16sdtfl w16du wp14">
   <w:body>
     <w:p>
       <w:pPr>
@@ -1578,23 +1578,7 @@
           <w:sz w:val="28"/>
           <w:szCs w:val="28"/>
         </w:rPr>
-        <w:t>Ansible</w:t>
-      </w:r>
-      <w:r>
-        <w:rPr>
-          <w:rFonts w:asciiTheme="majorBidi" w:hAnsiTheme="majorBidi" w:cstheme="majorBidi"/>
-          <w:sz w:val="28"/>
-          <w:szCs w:val="28"/>
-        </w:rPr>
-        <w:t xml:space="preserve"> </w:t>
-      </w:r>
-      <w:r>
-        <w:rPr>
-          <w:rFonts w:asciiTheme="majorBidi" w:hAnsiTheme="majorBidi" w:cstheme="majorBidi"/>
-          <w:sz w:val="28"/>
-          <w:szCs w:val="28"/>
-        </w:rPr>
-        <w:t>→ Push</w:t>
+        <w:t>Ansible → Push</w:t>
       </w:r>
     </w:p>
     <w:p>
@@ -1618,23 +1602,7 @@
           <w:sz w:val="28"/>
           <w:szCs w:val="28"/>
         </w:rPr>
-        <w:t>Puppet</w:t>
-      </w:r>
-      <w:r>
-        <w:rPr>
-          <w:rFonts w:asciiTheme="majorBidi" w:hAnsiTheme="majorBidi" w:cstheme="majorBidi"/>
-          <w:sz w:val="28"/>
-          <w:szCs w:val="28"/>
-        </w:rPr>
-        <w:t xml:space="preserve"> </w:t>
-      </w:r>
-      <w:r>
-        <w:rPr>
-          <w:rFonts w:asciiTheme="majorBidi" w:hAnsiTheme="majorBidi" w:cstheme="majorBidi"/>
-          <w:sz w:val="28"/>
-          <w:szCs w:val="28"/>
-        </w:rPr>
-        <w:t>→ Pull</w:t>
+        <w:t>Puppet → Pull</w:t>
       </w:r>
     </w:p>
     <w:p>
@@ -1659,23 +1627,7 @@
           <w:sz w:val="28"/>
           <w:szCs w:val="28"/>
         </w:rPr>
-        <w:t>Chef</w:t>
-      </w:r>
-      <w:r>
-        <w:rPr>
-          <w:rFonts w:asciiTheme="majorBidi" w:hAnsiTheme="majorBidi" w:cstheme="majorBidi"/>
-          <w:sz w:val="28"/>
-          <w:szCs w:val="28"/>
-        </w:rPr>
-        <w:t xml:space="preserve"> </w:t>
-      </w:r>
-      <w:r>
-        <w:rPr>
-          <w:rFonts w:asciiTheme="majorBidi" w:hAnsiTheme="majorBidi" w:cstheme="majorBidi"/>
-          <w:sz w:val="28"/>
-          <w:szCs w:val="28"/>
-        </w:rPr>
-        <w:t>→ Pull</w:t>
+        <w:t>Chef → Pull</w:t>
       </w:r>
     </w:p>
     <w:p>
@@ -9617,7 +9569,6 @@
           <w:szCs w:val="28"/>
         </w:rPr>
       </w:pPr>
-      <w:proofErr w:type="spellStart"/>
       <w:r>
         <w:rPr>
           <w:rFonts w:asciiTheme="majorBidi" w:hAnsiTheme="majorBidi" w:cstheme="majorBidi"/>
@@ -9628,7 +9579,6 @@
         </w:rPr>
         <w:t>ssh</w:t>
       </w:r>
-      <w:proofErr w:type="spellEnd"/>
     </w:p>
     <w:p>
       <w:pPr>
@@ -12089,23 +12039,7 @@
           <w:sz w:val="28"/>
           <w:szCs w:val="28"/>
         </w:rPr>
-        <w:t>First run</w:t>
-      </w:r>
-      <w:r>
-        <w:rPr>
-          <w:rFonts w:asciiTheme="majorBidi" w:hAnsiTheme="majorBidi" w:cstheme="majorBidi"/>
-          <w:sz w:val="28"/>
-          <w:szCs w:val="28"/>
-        </w:rPr>
-        <w:t xml:space="preserve"> </w:t>
-      </w:r>
-      <w:r>
-        <w:rPr>
-          <w:rFonts w:asciiTheme="majorBidi" w:hAnsiTheme="majorBidi" w:cstheme="majorBidi"/>
-          <w:sz w:val="28"/>
-          <w:szCs w:val="28"/>
-        </w:rPr>
-        <w:t xml:space="preserve">→ </w:t>
+        <w:t xml:space="preserve">First run → </w:t>
       </w:r>
       <w:r>
         <w:rPr>
@@ -12142,23 +12076,7 @@
           <w:sz w:val="28"/>
           <w:szCs w:val="28"/>
         </w:rPr>
-        <w:t>Second run</w:t>
-      </w:r>
-      <w:r>
-        <w:rPr>
-          <w:rFonts w:asciiTheme="majorBidi" w:hAnsiTheme="majorBidi" w:cstheme="majorBidi"/>
-          <w:sz w:val="28"/>
-          <w:szCs w:val="28"/>
-        </w:rPr>
-        <w:t xml:space="preserve"> </w:t>
-      </w:r>
-      <w:r>
-        <w:rPr>
-          <w:rFonts w:asciiTheme="majorBidi" w:hAnsiTheme="majorBidi" w:cstheme="majorBidi"/>
-          <w:sz w:val="28"/>
-          <w:szCs w:val="28"/>
-        </w:rPr>
-        <w:t xml:space="preserve">→ </w:t>
+        <w:t xml:space="preserve">Second run → </w:t>
       </w:r>
       <w:r>
         <w:rPr>
@@ -12178,23 +12096,7 @@
           <w:sz w:val="28"/>
           <w:szCs w:val="28"/>
         </w:rPr>
-        <w:t xml:space="preserve"> (</w:t>
-      </w:r>
-      <w:r>
-        <w:rPr>
-          <w:rFonts w:asciiTheme="majorBidi" w:hAnsiTheme="majorBidi" w:cstheme="majorBidi"/>
-          <w:sz w:val="28"/>
-          <w:szCs w:val="28"/>
-        </w:rPr>
-        <w:t>Because nginx is already installed.</w:t>
-      </w:r>
-      <w:r>
-        <w:rPr>
-          <w:rFonts w:asciiTheme="majorBidi" w:hAnsiTheme="majorBidi" w:cstheme="majorBidi"/>
-          <w:sz w:val="28"/>
-          <w:szCs w:val="28"/>
-        </w:rPr>
-        <w:t>)</w:t>
+        <w:t xml:space="preserve"> (Because nginx is already installed.)</w:t>
       </w:r>
     </w:p>
     <w:p>
@@ -13751,17 +13653,7 @@
           <w:sz w:val="32"/>
           <w:szCs w:val="32"/>
         </w:rPr>
-        <w:t>Parallel Execution</w:t>
-      </w:r>
-      <w:r>
-        <w:rPr>
-          <w:rFonts w:asciiTheme="majorBidi" w:hAnsiTheme="majorBidi" w:cstheme="majorBidi"/>
-          <w:b/>
-          <w:bCs/>
-          <w:sz w:val="32"/>
-          <w:szCs w:val="32"/>
-        </w:rPr>
-        <w:t>:</w:t>
+        <w:t>Parallel Execution:</w:t>
       </w:r>
     </w:p>
     <w:p>
@@ -14378,6 +14270,7 @@
     <w:p>
       <w:pPr>
         <w:spacing w:after="60"/>
+        <w:jc w:val="both"/>
         <w:rPr>
           <w:rFonts w:asciiTheme="majorBidi" w:hAnsiTheme="majorBidi" w:cstheme="majorBidi"/>
           <w:b/>
@@ -14405,6 +14298,7 @@
           <w:numId w:val="45"/>
         </w:numPr>
         <w:ind w:left="360"/>
+        <w:jc w:val="both"/>
         <w:rPr>
           <w:rFonts w:asciiTheme="majorBidi" w:hAnsiTheme="majorBidi" w:cstheme="majorBidi"/>
           <w:sz w:val="28"/>
@@ -14428,6 +14322,7 @@
           <w:numId w:val="45"/>
         </w:numPr>
         <w:ind w:left="360"/>
+        <w:jc w:val="both"/>
         <w:rPr>
           <w:rFonts w:asciiTheme="majorBidi" w:hAnsiTheme="majorBidi" w:cstheme="majorBidi"/>
           <w:sz w:val="28"/>
@@ -14451,6 +14346,7 @@
           <w:numId w:val="45"/>
         </w:numPr>
         <w:ind w:left="360"/>
+        <w:jc w:val="both"/>
         <w:rPr>
           <w:rFonts w:asciiTheme="majorBidi" w:hAnsiTheme="majorBidi" w:cstheme="majorBidi"/>
           <w:sz w:val="28"/>
@@ -14474,6 +14370,7 @@
           <w:numId w:val="45"/>
         </w:numPr>
         <w:ind w:left="360"/>
+        <w:jc w:val="both"/>
         <w:rPr>
           <w:rFonts w:asciiTheme="majorBidi" w:hAnsiTheme="majorBidi" w:cstheme="majorBidi"/>
           <w:sz w:val="28"/>
@@ -14497,6 +14394,7 @@
           <w:numId w:val="45"/>
         </w:numPr>
         <w:ind w:left="360"/>
+        <w:jc w:val="both"/>
         <w:rPr>
           <w:rFonts w:asciiTheme="majorBidi" w:hAnsiTheme="majorBidi" w:cstheme="majorBidi"/>
           <w:sz w:val="28"/>
@@ -14521,6 +14419,7 @@
         </w:numPr>
         <w:spacing w:after="60"/>
         <w:ind w:left="360"/>
+        <w:jc w:val="both"/>
         <w:rPr>
           <w:rFonts w:asciiTheme="majorBidi" w:hAnsiTheme="majorBidi" w:cstheme="majorBidi"/>
           <w:sz w:val="28"/>
@@ -14539,6 +14438,7 @@
     <w:p>
       <w:pPr>
         <w:spacing w:after="100"/>
+        <w:jc w:val="both"/>
         <w:rPr>
           <w:rFonts w:asciiTheme="majorBidi" w:hAnsiTheme="majorBidi" w:cstheme="majorBidi"/>
           <w:sz w:val="28"/>
@@ -14573,6 +14473,7 @@
     <w:p>
       <w:pPr>
         <w:spacing w:after="80"/>
+        <w:jc w:val="both"/>
         <w:rPr>
           <w:rFonts w:asciiTheme="majorBidi" w:hAnsiTheme="majorBidi" w:cstheme="majorBidi"/>
           <w:b/>
@@ -14605,6 +14506,7 @@
     <w:p>
       <w:pPr>
         <w:spacing w:after="80"/>
+        <w:jc w:val="both"/>
         <w:rPr>
           <w:rFonts w:asciiTheme="majorBidi" w:hAnsiTheme="majorBidi" w:cstheme="majorBidi"/>
           <w:sz w:val="28"/>
@@ -14623,6 +14525,7 @@
     <w:p>
       <w:pPr>
         <w:spacing w:after="60"/>
+        <w:jc w:val="both"/>
         <w:rPr>
           <w:rFonts w:asciiTheme="majorBidi" w:hAnsiTheme="majorBidi" w:cstheme="majorBidi"/>
           <w:b/>
@@ -14650,6 +14553,7 @@
           <w:numId w:val="46"/>
         </w:numPr>
         <w:ind w:left="360"/>
+        <w:jc w:val="both"/>
         <w:rPr>
           <w:rFonts w:asciiTheme="majorBidi" w:hAnsiTheme="majorBidi" w:cstheme="majorBidi"/>
           <w:sz w:val="28"/>
@@ -14673,6 +14577,7 @@
           <w:numId w:val="46"/>
         </w:numPr>
         <w:ind w:left="360"/>
+        <w:jc w:val="both"/>
         <w:rPr>
           <w:rFonts w:asciiTheme="majorBidi" w:hAnsiTheme="majorBidi" w:cstheme="majorBidi"/>
           <w:sz w:val="28"/>
@@ -14696,6 +14601,7 @@
           <w:numId w:val="46"/>
         </w:numPr>
         <w:ind w:left="360"/>
+        <w:jc w:val="both"/>
         <w:rPr>
           <w:rFonts w:asciiTheme="majorBidi" w:hAnsiTheme="majorBidi" w:cstheme="majorBidi"/>
           <w:sz w:val="28"/>
@@ -14719,6 +14625,7 @@
           <w:numId w:val="46"/>
         </w:numPr>
         <w:ind w:left="360"/>
+        <w:jc w:val="both"/>
         <w:rPr>
           <w:rFonts w:asciiTheme="majorBidi" w:hAnsiTheme="majorBidi" w:cstheme="majorBidi"/>
           <w:sz w:val="28"/>
@@ -14742,6 +14649,7 @@
           <w:numId w:val="46"/>
         </w:numPr>
         <w:ind w:left="360"/>
+        <w:jc w:val="both"/>
         <w:rPr>
           <w:rFonts w:asciiTheme="majorBidi" w:hAnsiTheme="majorBidi" w:cstheme="majorBidi"/>
           <w:sz w:val="28"/>
@@ -14765,6 +14673,7 @@
           <w:numId w:val="46"/>
         </w:numPr>
         <w:ind w:left="360"/>
+        <w:jc w:val="both"/>
         <w:rPr>
           <w:rFonts w:asciiTheme="majorBidi" w:hAnsiTheme="majorBidi" w:cstheme="majorBidi"/>
           <w:sz w:val="28"/>
@@ -14789,6 +14698,7 @@
         </w:numPr>
         <w:spacing w:after="80"/>
         <w:ind w:left="360"/>
+        <w:jc w:val="both"/>
         <w:rPr>
           <w:rFonts w:asciiTheme="majorBidi" w:hAnsiTheme="majorBidi" w:cstheme="majorBidi"/>
           <w:sz w:val="28"/>
@@ -14807,6 +14717,7 @@
     <w:p>
       <w:pPr>
         <w:spacing w:after="60"/>
+        <w:jc w:val="both"/>
         <w:rPr>
           <w:rFonts w:asciiTheme="majorBidi" w:hAnsiTheme="majorBidi" w:cstheme="majorBidi"/>
           <w:sz w:val="28"/>
@@ -14827,34 +14738,26 @@
     <w:p>
       <w:pPr>
         <w:spacing w:after="100"/>
-        <w:rPr>
-          <w:rFonts w:asciiTheme="majorBidi" w:hAnsiTheme="majorBidi" w:cstheme="majorBidi"/>
-          <w:sz w:val="28"/>
-          <w:szCs w:val="28"/>
-        </w:rPr>
-      </w:pPr>
-      <w:proofErr w:type="spellStart"/>
-      <w:r>
-        <w:rPr>
-          <w:rFonts w:asciiTheme="majorBidi" w:hAnsiTheme="majorBidi" w:cstheme="majorBidi"/>
-          <w:sz w:val="28"/>
-          <w:szCs w:val="28"/>
-        </w:rPr>
-        <w:t>ssh</w:t>
-      </w:r>
-      <w:proofErr w:type="spellEnd"/>
-      <w:r>
-        <w:rPr>
-          <w:rFonts w:asciiTheme="majorBidi" w:hAnsiTheme="majorBidi" w:cstheme="majorBidi"/>
-          <w:sz w:val="28"/>
-          <w:szCs w:val="28"/>
-        </w:rPr>
-        <w:t xml:space="preserve"> connection plugin</w:t>
+        <w:jc w:val="both"/>
+        <w:rPr>
+          <w:rFonts w:asciiTheme="majorBidi" w:hAnsiTheme="majorBidi" w:cstheme="majorBidi"/>
+          <w:sz w:val="28"/>
+          <w:szCs w:val="28"/>
+        </w:rPr>
+      </w:pPr>
+      <w:r>
+        <w:rPr>
+          <w:rFonts w:asciiTheme="majorBidi" w:hAnsiTheme="majorBidi" w:cstheme="majorBidi"/>
+          <w:sz w:val="28"/>
+          <w:szCs w:val="28"/>
+        </w:rPr>
+        <w:t>ssh connection plugin</w:t>
       </w:r>
     </w:p>
     <w:p>
       <w:pPr>
         <w:spacing w:after="60"/>
+        <w:jc w:val="both"/>
         <w:rPr>
           <w:rFonts w:asciiTheme="majorBidi" w:hAnsiTheme="majorBidi" w:cstheme="majorBidi"/>
           <w:b/>
@@ -14887,6 +14790,7 @@
     <w:p>
       <w:pPr>
         <w:spacing w:after="60"/>
+        <w:jc w:val="both"/>
         <w:rPr>
           <w:rFonts w:asciiTheme="majorBidi" w:hAnsiTheme="majorBidi" w:cstheme="majorBidi"/>
           <w:sz w:val="28"/>
@@ -14910,35 +14814,20 @@
           <w:numId w:val="47"/>
         </w:numPr>
         <w:ind w:left="360"/>
-        <w:rPr>
-          <w:rFonts w:asciiTheme="majorBidi" w:hAnsiTheme="majorBidi" w:cstheme="majorBidi"/>
-          <w:sz w:val="28"/>
-          <w:szCs w:val="28"/>
-        </w:rPr>
-      </w:pPr>
-      <w:r>
-        <w:rPr>
-          <w:rFonts w:asciiTheme="majorBidi" w:hAnsiTheme="majorBidi" w:cstheme="majorBidi"/>
-          <w:sz w:val="28"/>
-          <w:szCs w:val="28"/>
-        </w:rPr>
-        <w:t>Inventory</w:t>
-      </w:r>
-      <w:r>
-        <w:rPr>
-          <w:rFonts w:asciiTheme="majorBidi" w:hAnsiTheme="majorBidi" w:cstheme="majorBidi"/>
-          <w:sz w:val="28"/>
-          <w:szCs w:val="28"/>
-        </w:rPr>
-        <w:t xml:space="preserve"> </w:t>
-      </w:r>
-      <w:r>
-        <w:rPr>
-          <w:rFonts w:asciiTheme="majorBidi" w:hAnsiTheme="majorBidi" w:cstheme="majorBidi"/>
-          <w:sz w:val="28"/>
-          <w:szCs w:val="28"/>
-        </w:rPr>
-        <w:t>→ Defines managed hosts</w:t>
+        <w:jc w:val="both"/>
+        <w:rPr>
+          <w:rFonts w:asciiTheme="majorBidi" w:hAnsiTheme="majorBidi" w:cstheme="majorBidi"/>
+          <w:sz w:val="28"/>
+          <w:szCs w:val="28"/>
+        </w:rPr>
+      </w:pPr>
+      <w:r>
+        <w:rPr>
+          <w:rFonts w:asciiTheme="majorBidi" w:hAnsiTheme="majorBidi" w:cstheme="majorBidi"/>
+          <w:sz w:val="28"/>
+          <w:szCs w:val="28"/>
+        </w:rPr>
+        <w:t>Inventory → Defines managed hosts</w:t>
       </w:r>
     </w:p>
     <w:p>
@@ -14949,35 +14838,20 @@
           <w:numId w:val="47"/>
         </w:numPr>
         <w:ind w:left="360"/>
-        <w:rPr>
-          <w:rFonts w:asciiTheme="majorBidi" w:hAnsiTheme="majorBidi" w:cstheme="majorBidi"/>
-          <w:sz w:val="28"/>
-          <w:szCs w:val="28"/>
-        </w:rPr>
-      </w:pPr>
-      <w:r>
-        <w:rPr>
-          <w:rFonts w:asciiTheme="majorBidi" w:hAnsiTheme="majorBidi" w:cstheme="majorBidi"/>
-          <w:sz w:val="28"/>
-          <w:szCs w:val="28"/>
-        </w:rPr>
-        <w:t>Playbooks</w:t>
-      </w:r>
-      <w:r>
-        <w:rPr>
-          <w:rFonts w:asciiTheme="majorBidi" w:hAnsiTheme="majorBidi" w:cstheme="majorBidi"/>
-          <w:sz w:val="28"/>
-          <w:szCs w:val="28"/>
-        </w:rPr>
-        <w:t xml:space="preserve"> </w:t>
-      </w:r>
-      <w:r>
-        <w:rPr>
-          <w:rFonts w:asciiTheme="majorBidi" w:hAnsiTheme="majorBidi" w:cstheme="majorBidi"/>
-          <w:sz w:val="28"/>
-          <w:szCs w:val="28"/>
-        </w:rPr>
-        <w:t>→ Define automation tasks</w:t>
+        <w:jc w:val="both"/>
+        <w:rPr>
+          <w:rFonts w:asciiTheme="majorBidi" w:hAnsiTheme="majorBidi" w:cstheme="majorBidi"/>
+          <w:sz w:val="28"/>
+          <w:szCs w:val="28"/>
+        </w:rPr>
+      </w:pPr>
+      <w:r>
+        <w:rPr>
+          <w:rFonts w:asciiTheme="majorBidi" w:hAnsiTheme="majorBidi" w:cstheme="majorBidi"/>
+          <w:sz w:val="28"/>
+          <w:szCs w:val="28"/>
+        </w:rPr>
+        <w:t>Playbooks → Define automation tasks</w:t>
       </w:r>
     </w:p>
     <w:p>
@@ -14988,35 +14862,20 @@
           <w:numId w:val="47"/>
         </w:numPr>
         <w:ind w:left="360"/>
-        <w:rPr>
-          <w:rFonts w:asciiTheme="majorBidi" w:hAnsiTheme="majorBidi" w:cstheme="majorBidi"/>
-          <w:sz w:val="28"/>
-          <w:szCs w:val="28"/>
-        </w:rPr>
-      </w:pPr>
-      <w:r>
-        <w:rPr>
-          <w:rFonts w:asciiTheme="majorBidi" w:hAnsiTheme="majorBidi" w:cstheme="majorBidi"/>
-          <w:sz w:val="28"/>
-          <w:szCs w:val="28"/>
-        </w:rPr>
-        <w:t>Modules</w:t>
-      </w:r>
-      <w:r>
-        <w:rPr>
-          <w:rFonts w:asciiTheme="majorBidi" w:hAnsiTheme="majorBidi" w:cstheme="majorBidi"/>
-          <w:sz w:val="28"/>
-          <w:szCs w:val="28"/>
-        </w:rPr>
-        <w:t xml:space="preserve"> </w:t>
-      </w:r>
-      <w:r>
-        <w:rPr>
-          <w:rFonts w:asciiTheme="majorBidi" w:hAnsiTheme="majorBidi" w:cstheme="majorBidi"/>
-          <w:sz w:val="28"/>
-          <w:szCs w:val="28"/>
-        </w:rPr>
-        <w:t>→ Perform actions</w:t>
+        <w:jc w:val="both"/>
+        <w:rPr>
+          <w:rFonts w:asciiTheme="majorBidi" w:hAnsiTheme="majorBidi" w:cstheme="majorBidi"/>
+          <w:sz w:val="28"/>
+          <w:szCs w:val="28"/>
+        </w:rPr>
+      </w:pPr>
+      <w:r>
+        <w:rPr>
+          <w:rFonts w:asciiTheme="majorBidi" w:hAnsiTheme="majorBidi" w:cstheme="majorBidi"/>
+          <w:sz w:val="28"/>
+          <w:szCs w:val="28"/>
+        </w:rPr>
+        <w:t>Modules → Perform actions</w:t>
       </w:r>
     </w:p>
     <w:p>
@@ -15027,35 +14886,20 @@
           <w:numId w:val="47"/>
         </w:numPr>
         <w:ind w:left="360"/>
-        <w:rPr>
-          <w:rFonts w:asciiTheme="majorBidi" w:hAnsiTheme="majorBidi" w:cstheme="majorBidi"/>
-          <w:sz w:val="28"/>
-          <w:szCs w:val="28"/>
-        </w:rPr>
-      </w:pPr>
-      <w:r>
-        <w:rPr>
-          <w:rFonts w:asciiTheme="majorBidi" w:hAnsiTheme="majorBidi" w:cstheme="majorBidi"/>
-          <w:sz w:val="28"/>
-          <w:szCs w:val="28"/>
-        </w:rPr>
-        <w:t>Variables</w:t>
-      </w:r>
-      <w:r>
-        <w:rPr>
-          <w:rFonts w:asciiTheme="majorBidi" w:hAnsiTheme="majorBidi" w:cstheme="majorBidi"/>
-          <w:sz w:val="28"/>
-          <w:szCs w:val="28"/>
-        </w:rPr>
-        <w:t xml:space="preserve"> </w:t>
-      </w:r>
-      <w:r>
-        <w:rPr>
-          <w:rFonts w:asciiTheme="majorBidi" w:hAnsiTheme="majorBidi" w:cstheme="majorBidi"/>
-          <w:sz w:val="28"/>
-          <w:szCs w:val="28"/>
-        </w:rPr>
-        <w:t>→ Store dynamic values</w:t>
+        <w:jc w:val="both"/>
+        <w:rPr>
+          <w:rFonts w:asciiTheme="majorBidi" w:hAnsiTheme="majorBidi" w:cstheme="majorBidi"/>
+          <w:sz w:val="28"/>
+          <w:szCs w:val="28"/>
+        </w:rPr>
+      </w:pPr>
+      <w:r>
+        <w:rPr>
+          <w:rFonts w:asciiTheme="majorBidi" w:hAnsiTheme="majorBidi" w:cstheme="majorBidi"/>
+          <w:sz w:val="28"/>
+          <w:szCs w:val="28"/>
+        </w:rPr>
+        <w:t>Variables → Store dynamic values</w:t>
       </w:r>
     </w:p>
     <w:p>
@@ -15066,35 +14910,20 @@
           <w:numId w:val="47"/>
         </w:numPr>
         <w:ind w:left="360"/>
-        <w:rPr>
-          <w:rFonts w:asciiTheme="majorBidi" w:hAnsiTheme="majorBidi" w:cstheme="majorBidi"/>
-          <w:sz w:val="28"/>
-          <w:szCs w:val="28"/>
-        </w:rPr>
-      </w:pPr>
-      <w:r>
-        <w:rPr>
-          <w:rFonts w:asciiTheme="majorBidi" w:hAnsiTheme="majorBidi" w:cstheme="majorBidi"/>
-          <w:sz w:val="28"/>
-          <w:szCs w:val="28"/>
-        </w:rPr>
-        <w:t>Facts</w:t>
-      </w:r>
-      <w:r>
-        <w:rPr>
-          <w:rFonts w:asciiTheme="majorBidi" w:hAnsiTheme="majorBidi" w:cstheme="majorBidi"/>
-          <w:sz w:val="28"/>
-          <w:szCs w:val="28"/>
-        </w:rPr>
-        <w:t xml:space="preserve"> </w:t>
-      </w:r>
-      <w:r>
-        <w:rPr>
-          <w:rFonts w:asciiTheme="majorBidi" w:hAnsiTheme="majorBidi" w:cstheme="majorBidi"/>
-          <w:sz w:val="28"/>
-          <w:szCs w:val="28"/>
-        </w:rPr>
-        <w:t>→ System information</w:t>
+        <w:jc w:val="both"/>
+        <w:rPr>
+          <w:rFonts w:asciiTheme="majorBidi" w:hAnsiTheme="majorBidi" w:cstheme="majorBidi"/>
+          <w:sz w:val="28"/>
+          <w:szCs w:val="28"/>
+        </w:rPr>
+      </w:pPr>
+      <w:r>
+        <w:rPr>
+          <w:rFonts w:asciiTheme="majorBidi" w:hAnsiTheme="majorBidi" w:cstheme="majorBidi"/>
+          <w:sz w:val="28"/>
+          <w:szCs w:val="28"/>
+        </w:rPr>
+        <w:t>Facts → System information</w:t>
       </w:r>
     </w:p>
     <w:p>
@@ -15105,35 +14934,20 @@
           <w:numId w:val="47"/>
         </w:numPr>
         <w:ind w:left="360"/>
-        <w:rPr>
-          <w:rFonts w:asciiTheme="majorBidi" w:hAnsiTheme="majorBidi" w:cstheme="majorBidi"/>
-          <w:sz w:val="28"/>
-          <w:szCs w:val="28"/>
-        </w:rPr>
-      </w:pPr>
-      <w:r>
-        <w:rPr>
-          <w:rFonts w:asciiTheme="majorBidi" w:hAnsiTheme="majorBidi" w:cstheme="majorBidi"/>
-          <w:sz w:val="28"/>
-          <w:szCs w:val="28"/>
-        </w:rPr>
-        <w:t>Templates</w:t>
-      </w:r>
-      <w:r>
-        <w:rPr>
-          <w:rFonts w:asciiTheme="majorBidi" w:hAnsiTheme="majorBidi" w:cstheme="majorBidi"/>
-          <w:sz w:val="28"/>
-          <w:szCs w:val="28"/>
-        </w:rPr>
-        <w:t xml:space="preserve"> </w:t>
-      </w:r>
-      <w:r>
-        <w:rPr>
-          <w:rFonts w:asciiTheme="majorBidi" w:hAnsiTheme="majorBidi" w:cstheme="majorBidi"/>
-          <w:sz w:val="28"/>
-          <w:szCs w:val="28"/>
-        </w:rPr>
-        <w:t>→ Dynamic config files</w:t>
+        <w:jc w:val="both"/>
+        <w:rPr>
+          <w:rFonts w:asciiTheme="majorBidi" w:hAnsiTheme="majorBidi" w:cstheme="majorBidi"/>
+          <w:sz w:val="28"/>
+          <w:szCs w:val="28"/>
+        </w:rPr>
+      </w:pPr>
+      <w:r>
+        <w:rPr>
+          <w:rFonts w:asciiTheme="majorBidi" w:hAnsiTheme="majorBidi" w:cstheme="majorBidi"/>
+          <w:sz w:val="28"/>
+          <w:szCs w:val="28"/>
+        </w:rPr>
+        <w:t>Templates → Dynamic config files</w:t>
       </w:r>
     </w:p>
     <w:p>
@@ -15144,35 +14958,20 @@
           <w:numId w:val="47"/>
         </w:numPr>
         <w:ind w:left="360"/>
-        <w:rPr>
-          <w:rFonts w:asciiTheme="majorBidi" w:hAnsiTheme="majorBidi" w:cstheme="majorBidi"/>
-          <w:sz w:val="28"/>
-          <w:szCs w:val="28"/>
-        </w:rPr>
-      </w:pPr>
-      <w:r>
-        <w:rPr>
-          <w:rFonts w:asciiTheme="majorBidi" w:hAnsiTheme="majorBidi" w:cstheme="majorBidi"/>
-          <w:sz w:val="28"/>
-          <w:szCs w:val="28"/>
-        </w:rPr>
-        <w:t>Handlers</w:t>
-      </w:r>
-      <w:r>
-        <w:rPr>
-          <w:rFonts w:asciiTheme="majorBidi" w:hAnsiTheme="majorBidi" w:cstheme="majorBidi"/>
-          <w:sz w:val="28"/>
-          <w:szCs w:val="28"/>
-        </w:rPr>
-        <w:t xml:space="preserve"> </w:t>
-      </w:r>
-      <w:r>
-        <w:rPr>
-          <w:rFonts w:asciiTheme="majorBidi" w:hAnsiTheme="majorBidi" w:cstheme="majorBidi"/>
-          <w:sz w:val="28"/>
-          <w:szCs w:val="28"/>
-        </w:rPr>
-        <w:t>→ Triggered tasks</w:t>
+        <w:jc w:val="both"/>
+        <w:rPr>
+          <w:rFonts w:asciiTheme="majorBidi" w:hAnsiTheme="majorBidi" w:cstheme="majorBidi"/>
+          <w:sz w:val="28"/>
+          <w:szCs w:val="28"/>
+        </w:rPr>
+      </w:pPr>
+      <w:r>
+        <w:rPr>
+          <w:rFonts w:asciiTheme="majorBidi" w:hAnsiTheme="majorBidi" w:cstheme="majorBidi"/>
+          <w:sz w:val="28"/>
+          <w:szCs w:val="28"/>
+        </w:rPr>
+        <w:t>Handlers → Triggered tasks</w:t>
       </w:r>
     </w:p>
     <w:p>
@@ -15183,35 +14982,20 @@
           <w:numId w:val="47"/>
         </w:numPr>
         <w:ind w:left="360"/>
-        <w:rPr>
-          <w:rFonts w:asciiTheme="majorBidi" w:hAnsiTheme="majorBidi" w:cstheme="majorBidi"/>
-          <w:sz w:val="28"/>
-          <w:szCs w:val="28"/>
-        </w:rPr>
-      </w:pPr>
-      <w:r>
-        <w:rPr>
-          <w:rFonts w:asciiTheme="majorBidi" w:hAnsiTheme="majorBidi" w:cstheme="majorBidi"/>
-          <w:sz w:val="28"/>
-          <w:szCs w:val="28"/>
-        </w:rPr>
-        <w:t>Roles</w:t>
-      </w:r>
-      <w:r>
-        <w:rPr>
-          <w:rFonts w:asciiTheme="majorBidi" w:hAnsiTheme="majorBidi" w:cstheme="majorBidi"/>
-          <w:sz w:val="28"/>
-          <w:szCs w:val="28"/>
-        </w:rPr>
-        <w:t xml:space="preserve"> </w:t>
-      </w:r>
-      <w:r>
-        <w:rPr>
-          <w:rFonts w:asciiTheme="majorBidi" w:hAnsiTheme="majorBidi" w:cstheme="majorBidi"/>
-          <w:sz w:val="28"/>
-          <w:szCs w:val="28"/>
-        </w:rPr>
-        <w:t>→ Organized automation</w:t>
+        <w:jc w:val="both"/>
+        <w:rPr>
+          <w:rFonts w:asciiTheme="majorBidi" w:hAnsiTheme="majorBidi" w:cstheme="majorBidi"/>
+          <w:sz w:val="28"/>
+          <w:szCs w:val="28"/>
+        </w:rPr>
+      </w:pPr>
+      <w:r>
+        <w:rPr>
+          <w:rFonts w:asciiTheme="majorBidi" w:hAnsiTheme="majorBidi" w:cstheme="majorBidi"/>
+          <w:sz w:val="28"/>
+          <w:szCs w:val="28"/>
+        </w:rPr>
+        <w:t>Roles → Organized automation</w:t>
       </w:r>
     </w:p>
     <w:p>
@@ -15223,40 +15007,26 @@
         </w:numPr>
         <w:spacing w:after="100"/>
         <w:ind w:left="360"/>
-        <w:rPr>
-          <w:rFonts w:asciiTheme="majorBidi" w:hAnsiTheme="majorBidi" w:cstheme="majorBidi"/>
-          <w:sz w:val="28"/>
-          <w:szCs w:val="28"/>
-        </w:rPr>
-      </w:pPr>
-      <w:r>
-        <w:rPr>
-          <w:rFonts w:asciiTheme="majorBidi" w:hAnsiTheme="majorBidi" w:cstheme="majorBidi"/>
-          <w:sz w:val="28"/>
-          <w:szCs w:val="28"/>
-        </w:rPr>
-        <w:t>Collections</w:t>
-      </w:r>
-      <w:r>
-        <w:rPr>
-          <w:rFonts w:asciiTheme="majorBidi" w:hAnsiTheme="majorBidi" w:cstheme="majorBidi"/>
-          <w:sz w:val="28"/>
-          <w:szCs w:val="28"/>
-        </w:rPr>
-        <w:t xml:space="preserve"> </w:t>
-      </w:r>
-      <w:r>
-        <w:rPr>
-          <w:rFonts w:asciiTheme="majorBidi" w:hAnsiTheme="majorBidi" w:cstheme="majorBidi"/>
-          <w:sz w:val="28"/>
-          <w:szCs w:val="28"/>
-        </w:rPr>
-        <w:t>→ Package of modules/plugins</w:t>
+        <w:jc w:val="both"/>
+        <w:rPr>
+          <w:rFonts w:asciiTheme="majorBidi" w:hAnsiTheme="majorBidi" w:cstheme="majorBidi"/>
+          <w:sz w:val="28"/>
+          <w:szCs w:val="28"/>
+        </w:rPr>
+      </w:pPr>
+      <w:r>
+        <w:rPr>
+          <w:rFonts w:asciiTheme="majorBidi" w:hAnsiTheme="majorBidi" w:cstheme="majorBidi"/>
+          <w:sz w:val="28"/>
+          <w:szCs w:val="28"/>
+        </w:rPr>
+        <w:t>Collections → Package of modules/plugins</w:t>
       </w:r>
     </w:p>
     <w:p>
       <w:pPr>
         <w:spacing w:after="60"/>
+        <w:jc w:val="both"/>
         <w:rPr>
           <w:rFonts w:asciiTheme="majorBidi" w:hAnsiTheme="majorBidi" w:cstheme="majorBidi"/>
           <w:b/>
@@ -15289,6 +15059,7 @@
     <w:p>
       <w:pPr>
         <w:spacing w:after="60"/>
+        <w:jc w:val="both"/>
         <w:rPr>
           <w:rFonts w:asciiTheme="majorBidi" w:hAnsiTheme="majorBidi" w:cstheme="majorBidi"/>
           <w:sz w:val="28"/>
@@ -15312,6 +15083,7 @@
           <w:numId w:val="48"/>
         </w:numPr>
         <w:ind w:left="360"/>
+        <w:jc w:val="both"/>
         <w:rPr>
           <w:rFonts w:asciiTheme="majorBidi" w:hAnsiTheme="majorBidi" w:cstheme="majorBidi"/>
           <w:sz w:val="28"/>
@@ -15335,6 +15107,7 @@
           <w:numId w:val="48"/>
         </w:numPr>
         <w:ind w:left="360"/>
+        <w:jc w:val="both"/>
         <w:rPr>
           <w:rFonts w:asciiTheme="majorBidi" w:hAnsiTheme="majorBidi" w:cstheme="majorBidi"/>
           <w:sz w:val="28"/>
@@ -15359,6 +15132,7 @@
           <w:numId w:val="48"/>
         </w:numPr>
         <w:ind w:left="360"/>
+        <w:jc w:val="both"/>
         <w:rPr>
           <w:rFonts w:asciiTheme="majorBidi" w:hAnsiTheme="majorBidi" w:cstheme="majorBidi"/>
           <w:sz w:val="28"/>
@@ -15381,8 +15155,9 @@
           <w:ilvl w:val="0"/>
           <w:numId w:val="48"/>
         </w:numPr>
-        <w:spacing w:after="120"/>
+        <w:spacing w:after="100"/>
         <w:ind w:left="360"/>
+        <w:jc w:val="both"/>
         <w:rPr>
           <w:rFonts w:asciiTheme="majorBidi" w:hAnsiTheme="majorBidi" w:cstheme="majorBidi"/>
           <w:sz w:val="28"/>
@@ -15401,6 +15176,7 @@
     <w:p>
       <w:pPr>
         <w:spacing w:after="80"/>
+        <w:jc w:val="both"/>
         <w:rPr>
           <w:rFonts w:asciiTheme="majorBidi" w:hAnsiTheme="majorBidi" w:cstheme="majorBidi"/>
           <w:b/>
@@ -15433,6 +15209,7 @@
     <w:p>
       <w:pPr>
         <w:spacing w:after="0"/>
+        <w:jc w:val="both"/>
         <w:rPr>
           <w:rFonts w:asciiTheme="majorBidi" w:hAnsiTheme="majorBidi" w:cstheme="majorBidi"/>
           <w:sz w:val="28"/>
@@ -15451,6 +15228,7 @@
     <w:p>
       <w:pPr>
         <w:spacing w:after="60"/>
+        <w:jc w:val="both"/>
         <w:rPr>
           <w:rFonts w:asciiTheme="majorBidi" w:hAnsiTheme="majorBidi" w:cstheme="majorBidi"/>
           <w:b/>
@@ -15476,6 +15254,7 @@
     </w:p>
     <w:p>
       <w:pPr>
+        <w:jc w:val="both"/>
         <w:rPr>
           <w:rFonts w:asciiTheme="majorBidi" w:hAnsiTheme="majorBidi" w:cstheme="majorBidi"/>
           <w:sz w:val="28"/>
@@ -16000,7 +15779,7 @@
           </mc:Choice>
           <mc:Fallback>
             <w:pict>
-              <v:rect w14:anchorId="1FD42674" id="Rectangle 13" o:spid="_x0000_s1037" style="position:absolute;margin-left:0;margin-top:20.5pt;width:227.25pt;height:303pt;z-index:251670528;visibility:visible;mso-wrap-style:square;mso-width-percent:0;mso-height-percent:0;mso-wrap-distance-left:9pt;mso-wrap-distance-top:0;mso-wrap-distance-right:9pt;mso-wrap-distance-bottom:0;mso-position-horizontal:left;mso-position-horizontal-relative:margin;mso-position-vertical:absolute;mso-position-vertical-relative:text;mso-width-percent:0;mso-height-percent:0;mso-width-relative:margin;mso-height-relative:margin;v-text-anchor:middle" o:gfxdata="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" fillcolor="black [3200]" strokecolor="black [480]" strokeweight="1pt">
+              <v:rect w14:anchorId="1FD42674" id="Rectangle 13" o:spid="_x0000_s1037" style="position:absolute;left:0;text-align:left;margin-left:0;margin-top:20.5pt;width:227.25pt;height:303pt;z-index:251670528;visibility:visible;mso-wrap-style:square;mso-width-percent:0;mso-height-percent:0;mso-wrap-distance-left:9pt;mso-wrap-distance-top:0;mso-wrap-distance-right:9pt;mso-wrap-distance-bottom:0;mso-position-horizontal:left;mso-position-horizontal-relative:margin;mso-position-vertical:absolute;mso-position-vertical-relative:text;mso-width-percent:0;mso-height-percent:0;mso-width-relative:margin;mso-height-relative:margin;v-text-anchor:middle" o:gfxdata="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" fillcolor="black [3200]" strokecolor="black [480]" strokeweight="1pt">
                 <v:textbox>
                   <w:txbxContent>
                     <w:p>
@@ -16464,129 +16243,528 @@
     </w:p>
     <w:p>
       <w:pPr>
-        <w:rPr>
-          <w:rFonts w:asciiTheme="majorBidi" w:hAnsiTheme="majorBidi" w:cstheme="majorBidi"/>
-          <w:sz w:val="28"/>
-          <w:szCs w:val="28"/>
-        </w:rPr>
-      </w:pPr>
-    </w:p>
-    <w:p>
-      <w:pPr>
-        <w:rPr>
-          <w:rFonts w:asciiTheme="majorBidi" w:hAnsiTheme="majorBidi" w:cstheme="majorBidi"/>
-          <w:sz w:val="28"/>
-          <w:szCs w:val="28"/>
-        </w:rPr>
-      </w:pPr>
-    </w:p>
-    <w:p>
-      <w:pPr>
-        <w:rPr>
-          <w:rFonts w:asciiTheme="majorBidi" w:hAnsiTheme="majorBidi" w:cstheme="majorBidi"/>
-          <w:sz w:val="28"/>
-          <w:szCs w:val="28"/>
-        </w:rPr>
-      </w:pPr>
-    </w:p>
-    <w:p>
-      <w:pPr>
-        <w:rPr>
-          <w:rFonts w:asciiTheme="majorBidi" w:hAnsiTheme="majorBidi" w:cstheme="majorBidi"/>
-          <w:sz w:val="28"/>
-          <w:szCs w:val="28"/>
-        </w:rPr>
-      </w:pPr>
-    </w:p>
-    <w:p>
-      <w:pPr>
-        <w:rPr>
-          <w:rFonts w:asciiTheme="majorBidi" w:hAnsiTheme="majorBidi" w:cstheme="majorBidi"/>
-          <w:sz w:val="28"/>
-          <w:szCs w:val="28"/>
-        </w:rPr>
-      </w:pPr>
-    </w:p>
-    <w:p>
-      <w:pPr>
-        <w:rPr>
-          <w:rFonts w:asciiTheme="majorBidi" w:hAnsiTheme="majorBidi" w:cstheme="majorBidi"/>
-          <w:sz w:val="28"/>
-          <w:szCs w:val="28"/>
-        </w:rPr>
-      </w:pPr>
-    </w:p>
-    <w:p>
-      <w:pPr>
-        <w:rPr>
-          <w:rFonts w:asciiTheme="majorBidi" w:hAnsiTheme="majorBidi" w:cstheme="majorBidi"/>
-          <w:sz w:val="28"/>
-          <w:szCs w:val="28"/>
-        </w:rPr>
-      </w:pPr>
-    </w:p>
-    <w:p>
-      <w:pPr>
-        <w:rPr>
-          <w:rFonts w:asciiTheme="majorBidi" w:hAnsiTheme="majorBidi" w:cstheme="majorBidi"/>
-          <w:sz w:val="28"/>
-          <w:szCs w:val="28"/>
-        </w:rPr>
-      </w:pPr>
-    </w:p>
-    <w:p>
-      <w:pPr>
-        <w:rPr>
-          <w:rFonts w:asciiTheme="majorBidi" w:hAnsiTheme="majorBidi" w:cstheme="majorBidi"/>
-          <w:sz w:val="28"/>
-          <w:szCs w:val="28"/>
-        </w:rPr>
-      </w:pPr>
-    </w:p>
-    <w:p>
-      <w:pPr>
-        <w:rPr>
-          <w:rFonts w:asciiTheme="majorBidi" w:hAnsiTheme="majorBidi" w:cstheme="majorBidi"/>
-          <w:sz w:val="28"/>
-          <w:szCs w:val="28"/>
-        </w:rPr>
-      </w:pPr>
-    </w:p>
-    <w:p>
-      <w:pPr>
-        <w:rPr>
-          <w:rFonts w:asciiTheme="majorBidi" w:hAnsiTheme="majorBidi" w:cstheme="majorBidi"/>
-          <w:sz w:val="28"/>
-          <w:szCs w:val="28"/>
-        </w:rPr>
-      </w:pPr>
-    </w:p>
-    <w:p>
-      <w:pPr>
-        <w:rPr>
-          <w:rFonts w:asciiTheme="majorBidi" w:hAnsiTheme="majorBidi" w:cstheme="majorBidi"/>
-          <w:sz w:val="28"/>
-          <w:szCs w:val="28"/>
-        </w:rPr>
-      </w:pPr>
-    </w:p>
-    <w:p>
-      <w:pPr>
-        <w:rPr>
-          <w:rFonts w:asciiTheme="majorBidi" w:hAnsiTheme="majorBidi" w:cstheme="majorBidi"/>
-          <w:sz w:val="28"/>
-          <w:szCs w:val="28"/>
-        </w:rPr>
-      </w:pPr>
-    </w:p>
-    <w:p>
-      <w:pPr>
-        <w:rPr>
-          <w:rFonts w:asciiTheme="majorBidi" w:hAnsiTheme="majorBidi" w:cstheme="majorBidi"/>
-          <w:sz w:val="28"/>
-          <w:szCs w:val="28"/>
-        </w:rPr>
-      </w:pPr>
+        <w:jc w:val="both"/>
+        <w:rPr>
+          <w:rFonts w:asciiTheme="majorBidi" w:hAnsiTheme="majorBidi" w:cstheme="majorBidi"/>
+          <w:sz w:val="28"/>
+          <w:szCs w:val="28"/>
+        </w:rPr>
+      </w:pPr>
+    </w:p>
+    <w:p>
+      <w:pPr>
+        <w:jc w:val="both"/>
+        <w:rPr>
+          <w:rFonts w:asciiTheme="majorBidi" w:hAnsiTheme="majorBidi" w:cstheme="majorBidi"/>
+          <w:sz w:val="28"/>
+          <w:szCs w:val="28"/>
+        </w:rPr>
+      </w:pPr>
+    </w:p>
+    <w:p>
+      <w:pPr>
+        <w:jc w:val="both"/>
+        <w:rPr>
+          <w:rFonts w:asciiTheme="majorBidi" w:hAnsiTheme="majorBidi" w:cstheme="majorBidi"/>
+          <w:sz w:val="28"/>
+          <w:szCs w:val="28"/>
+        </w:rPr>
+      </w:pPr>
+    </w:p>
+    <w:p>
+      <w:pPr>
+        <w:jc w:val="both"/>
+        <w:rPr>
+          <w:rFonts w:asciiTheme="majorBidi" w:hAnsiTheme="majorBidi" w:cstheme="majorBidi"/>
+          <w:sz w:val="28"/>
+          <w:szCs w:val="28"/>
+        </w:rPr>
+      </w:pPr>
+    </w:p>
+    <w:p>
+      <w:pPr>
+        <w:jc w:val="both"/>
+        <w:rPr>
+          <w:rFonts w:asciiTheme="majorBidi" w:hAnsiTheme="majorBidi" w:cstheme="majorBidi"/>
+          <w:sz w:val="28"/>
+          <w:szCs w:val="28"/>
+        </w:rPr>
+      </w:pPr>
+    </w:p>
+    <w:p>
+      <w:pPr>
+        <w:jc w:val="both"/>
+        <w:rPr>
+          <w:rFonts w:asciiTheme="majorBidi" w:hAnsiTheme="majorBidi" w:cstheme="majorBidi"/>
+          <w:sz w:val="28"/>
+          <w:szCs w:val="28"/>
+        </w:rPr>
+      </w:pPr>
+    </w:p>
+    <w:p>
+      <w:pPr>
+        <w:jc w:val="both"/>
+        <w:rPr>
+          <w:rFonts w:asciiTheme="majorBidi" w:hAnsiTheme="majorBidi" w:cstheme="majorBidi"/>
+          <w:sz w:val="28"/>
+          <w:szCs w:val="28"/>
+        </w:rPr>
+      </w:pPr>
+    </w:p>
+    <w:p>
+      <w:pPr>
+        <w:jc w:val="both"/>
+        <w:rPr>
+          <w:rFonts w:asciiTheme="majorBidi" w:hAnsiTheme="majorBidi" w:cstheme="majorBidi"/>
+          <w:sz w:val="28"/>
+          <w:szCs w:val="28"/>
+        </w:rPr>
+      </w:pPr>
+    </w:p>
+    <w:p>
+      <w:pPr>
+        <w:jc w:val="both"/>
+        <w:rPr>
+          <w:rFonts w:asciiTheme="majorBidi" w:hAnsiTheme="majorBidi" w:cstheme="majorBidi"/>
+          <w:sz w:val="28"/>
+          <w:szCs w:val="28"/>
+        </w:rPr>
+      </w:pPr>
+    </w:p>
+    <w:p>
+      <w:pPr>
+        <w:jc w:val="both"/>
+        <w:rPr>
+          <w:rFonts w:asciiTheme="majorBidi" w:hAnsiTheme="majorBidi" w:cstheme="majorBidi"/>
+          <w:sz w:val="28"/>
+          <w:szCs w:val="28"/>
+        </w:rPr>
+      </w:pPr>
+    </w:p>
+    <w:p>
+      <w:pPr>
+        <w:jc w:val="both"/>
+        <w:rPr>
+          <w:rFonts w:asciiTheme="majorBidi" w:hAnsiTheme="majorBidi" w:cstheme="majorBidi"/>
+          <w:sz w:val="28"/>
+          <w:szCs w:val="28"/>
+        </w:rPr>
+      </w:pPr>
+    </w:p>
+    <w:p>
+      <w:pPr>
+        <w:jc w:val="both"/>
+        <w:rPr>
+          <w:rFonts w:asciiTheme="majorBidi" w:hAnsiTheme="majorBidi" w:cstheme="majorBidi"/>
+          <w:sz w:val="28"/>
+          <w:szCs w:val="28"/>
+        </w:rPr>
+      </w:pPr>
+    </w:p>
+    <w:p>
+      <w:pPr>
+        <w:spacing w:after="100"/>
+        <w:jc w:val="both"/>
+        <w:rPr>
+          <w:rFonts w:asciiTheme="majorBidi" w:hAnsiTheme="majorBidi" w:cstheme="majorBidi"/>
+          <w:sz w:val="28"/>
+          <w:szCs w:val="28"/>
+        </w:rPr>
+      </w:pPr>
+      <w:r>
+        <w:rPr>
+          <w:rFonts w:asciiTheme="majorBidi" w:hAnsiTheme="majorBidi" w:cstheme="majorBidi"/>
+          <w:sz w:val="28"/>
+          <w:szCs w:val="28"/>
+        </w:rPr>
+        <w:t>Ansible does not usually install permanent agents or keep modules on the target.</w:t>
+      </w:r>
+      <w:r>
+        <w:rPr>
+          <w:rFonts w:asciiTheme="majorBidi" w:hAnsiTheme="majorBidi" w:cstheme="majorBidi"/>
+          <w:sz w:val="28"/>
+          <w:szCs w:val="28"/>
+        </w:rPr>
+        <w:t xml:space="preserve"> </w:t>
+      </w:r>
+      <w:r>
+        <w:rPr>
+          <w:rFonts w:asciiTheme="majorBidi" w:hAnsiTheme="majorBidi" w:cstheme="majorBidi"/>
+          <w:sz w:val="28"/>
+          <w:szCs w:val="28"/>
+        </w:rPr>
+        <w:t>That is part of why it is called agentless.</w:t>
+      </w:r>
+    </w:p>
+    <w:p>
+      <w:pPr>
+        <w:spacing w:after="60"/>
+        <w:jc w:val="both"/>
+        <w:rPr>
+          <w:rFonts w:asciiTheme="majorBidi" w:hAnsiTheme="majorBidi" w:cstheme="majorBidi"/>
+          <w:b/>
+          <w:bCs/>
+          <w:sz w:val="32"/>
+          <w:szCs w:val="32"/>
+        </w:rPr>
+      </w:pPr>
+      <w:r>
+        <w:rPr>
+          <w:rFonts w:asciiTheme="majorBidi" w:hAnsiTheme="majorBidi" w:cstheme="majorBidi"/>
+          <w:b/>
+          <w:bCs/>
+          <w:sz w:val="32"/>
+          <w:szCs w:val="32"/>
+        </w:rPr>
+        <w:t xml:space="preserve">Exception: </w:t>
+      </w:r>
+    </w:p>
+    <w:p>
+      <w:pPr>
+        <w:pStyle w:val="ListParagraph"/>
+        <w:numPr>
+          <w:ilvl w:val="0"/>
+          <w:numId w:val="51"/>
+        </w:numPr>
+        <w:spacing w:after="60"/>
+        <w:ind w:left="360"/>
+        <w:jc w:val="both"/>
+        <w:rPr>
+          <w:rFonts w:asciiTheme="majorBidi" w:hAnsiTheme="majorBidi" w:cstheme="majorBidi"/>
+          <w:b/>
+          <w:bCs/>
+          <w:sz w:val="28"/>
+          <w:szCs w:val="28"/>
+        </w:rPr>
+      </w:pPr>
+      <w:r>
+        <w:rPr>
+          <w:rFonts w:asciiTheme="majorBidi" w:hAnsiTheme="majorBidi" w:cstheme="majorBidi"/>
+          <w:b/>
+          <w:bCs/>
+          <w:sz w:val="28"/>
+          <w:szCs w:val="28"/>
+        </w:rPr>
+        <w:t>pipelining</w:t>
+      </w:r>
+    </w:p>
+    <w:p>
+      <w:pPr>
+        <w:spacing w:after="80"/>
+        <w:ind w:left="360"/>
+        <w:jc w:val="both"/>
+        <w:rPr>
+          <w:rFonts w:asciiTheme="majorBidi" w:hAnsiTheme="majorBidi" w:cstheme="majorBidi"/>
+          <w:sz w:val="28"/>
+          <w:szCs w:val="28"/>
+        </w:rPr>
+      </w:pPr>
+      <w:r>
+        <w:rPr>
+          <w:rFonts w:asciiTheme="majorBidi" w:hAnsiTheme="majorBidi" w:cstheme="majorBidi"/>
+          <w:sz w:val="28"/>
+          <w:szCs w:val="28"/>
+        </w:rPr>
+        <w:t>If SSH pipelining is enabled, Ansible may reduce or avoid some file-copy steps by sending module code through the connection more efficiently.</w:t>
+      </w:r>
+    </w:p>
+    <w:p>
+      <w:pPr>
+        <w:spacing w:after="60"/>
+        <w:ind w:left="360"/>
+        <w:jc w:val="both"/>
+        <w:rPr>
+          <w:rFonts w:asciiTheme="majorBidi" w:hAnsiTheme="majorBidi" w:cstheme="majorBidi"/>
+          <w:sz w:val="28"/>
+          <w:szCs w:val="28"/>
+        </w:rPr>
+      </w:pPr>
+      <w:r>
+        <w:rPr>
+          <w:rFonts w:asciiTheme="majorBidi" w:hAnsiTheme="majorBidi" w:cstheme="majorBidi"/>
+          <w:sz w:val="28"/>
+          <w:szCs w:val="28"/>
+        </w:rPr>
+        <w:t>So:</w:t>
+      </w:r>
+    </w:p>
+    <w:p>
+      <w:pPr>
+        <w:pStyle w:val="ListParagraph"/>
+        <w:numPr>
+          <w:ilvl w:val="0"/>
+          <w:numId w:val="52"/>
+        </w:numPr>
+        <w:jc w:val="both"/>
+        <w:rPr>
+          <w:rFonts w:asciiTheme="majorBidi" w:hAnsiTheme="majorBidi" w:cstheme="majorBidi"/>
+          <w:sz w:val="28"/>
+          <w:szCs w:val="28"/>
+        </w:rPr>
+      </w:pPr>
+      <w:r>
+        <w:rPr>
+          <w:rFonts w:asciiTheme="majorBidi" w:hAnsiTheme="majorBidi" w:cstheme="majorBidi"/>
+          <w:b/>
+          <w:bCs/>
+          <w:sz w:val="28"/>
+          <w:szCs w:val="28"/>
+        </w:rPr>
+        <w:t>without pipelining</w:t>
+      </w:r>
+      <w:r>
+        <w:rPr>
+          <w:rFonts w:asciiTheme="majorBidi" w:hAnsiTheme="majorBidi" w:cstheme="majorBidi"/>
+          <w:sz w:val="28"/>
+          <w:szCs w:val="28"/>
+        </w:rPr>
+        <w:t xml:space="preserve"> → copy temp module file, run it, delete it</w:t>
+      </w:r>
+    </w:p>
+    <w:p>
+      <w:pPr>
+        <w:pStyle w:val="ListParagraph"/>
+        <w:numPr>
+          <w:ilvl w:val="0"/>
+          <w:numId w:val="52"/>
+        </w:numPr>
+        <w:spacing w:after="60"/>
+        <w:jc w:val="both"/>
+        <w:rPr>
+          <w:rFonts w:asciiTheme="majorBidi" w:hAnsiTheme="majorBidi" w:cstheme="majorBidi"/>
+          <w:sz w:val="28"/>
+          <w:szCs w:val="28"/>
+        </w:rPr>
+      </w:pPr>
+      <w:r>
+        <w:rPr>
+          <w:rFonts w:asciiTheme="majorBidi" w:hAnsiTheme="majorBidi" w:cstheme="majorBidi"/>
+          <w:b/>
+          <w:bCs/>
+          <w:sz w:val="28"/>
+          <w:szCs w:val="28"/>
+        </w:rPr>
+        <w:t>with pipelining</w:t>
+      </w:r>
+      <w:r>
+        <w:rPr>
+          <w:rFonts w:asciiTheme="majorBidi" w:hAnsiTheme="majorBidi" w:cstheme="majorBidi"/>
+          <w:sz w:val="28"/>
+          <w:szCs w:val="28"/>
+        </w:rPr>
+        <w:t xml:space="preserve"> → less remote file creation in some cases</w:t>
+      </w:r>
+    </w:p>
+    <w:p>
+      <w:pPr>
+        <w:spacing w:after="100"/>
+        <w:ind w:left="360"/>
+        <w:jc w:val="both"/>
+        <w:rPr>
+          <w:rFonts w:asciiTheme="majorBidi" w:hAnsiTheme="majorBidi" w:cstheme="majorBidi"/>
+          <w:sz w:val="28"/>
+          <w:szCs w:val="28"/>
+        </w:rPr>
+      </w:pPr>
+      <w:r>
+        <w:rPr>
+          <w:rFonts w:asciiTheme="majorBidi" w:hAnsiTheme="majorBidi" w:cstheme="majorBidi"/>
+          <w:sz w:val="28"/>
+          <w:szCs w:val="28"/>
+        </w:rPr>
+        <w:t>But conceptually, yes, Ansible still treats module execution artifacts as temporary.</w:t>
+      </w:r>
+    </w:p>
+    <w:p>
+      <w:pPr>
+        <w:pStyle w:val="ListParagraph"/>
+        <w:numPr>
+          <w:ilvl w:val="0"/>
+          <w:numId w:val="50"/>
+        </w:numPr>
+        <w:spacing w:after="60"/>
+        <w:ind w:left="360"/>
+        <w:jc w:val="both"/>
+        <w:rPr>
+          <w:rFonts w:asciiTheme="majorBidi" w:hAnsiTheme="majorBidi" w:cstheme="majorBidi"/>
+          <w:b/>
+          <w:bCs/>
+          <w:sz w:val="28"/>
+          <w:szCs w:val="28"/>
+        </w:rPr>
+      </w:pPr>
+      <w:r>
+        <w:rPr>
+          <w:rFonts w:asciiTheme="majorBidi" w:hAnsiTheme="majorBidi" w:cstheme="majorBidi"/>
+          <w:b/>
+          <w:bCs/>
+          <w:sz w:val="28"/>
+          <w:szCs w:val="28"/>
+        </w:rPr>
+        <w:t>debugging / failure cases</w:t>
+      </w:r>
+    </w:p>
+    <w:p>
+      <w:pPr>
+        <w:spacing w:after="60"/>
+        <w:ind w:left="360"/>
+        <w:jc w:val="both"/>
+        <w:rPr>
+          <w:rFonts w:asciiTheme="majorBidi" w:hAnsiTheme="majorBidi" w:cstheme="majorBidi"/>
+          <w:sz w:val="28"/>
+          <w:szCs w:val="28"/>
+        </w:rPr>
+      </w:pPr>
+      <w:r>
+        <w:rPr>
+          <w:rFonts w:asciiTheme="majorBidi" w:hAnsiTheme="majorBidi" w:cstheme="majorBidi"/>
+          <w:sz w:val="28"/>
+          <w:szCs w:val="28"/>
+        </w:rPr>
+        <w:t>Sometimes temp files may remain if:</w:t>
+      </w:r>
+    </w:p>
+    <w:p>
+      <w:pPr>
+        <w:pStyle w:val="ListParagraph"/>
+        <w:numPr>
+          <w:ilvl w:val="0"/>
+          <w:numId w:val="53"/>
+        </w:numPr>
+        <w:jc w:val="both"/>
+        <w:rPr>
+          <w:rFonts w:asciiTheme="majorBidi" w:hAnsiTheme="majorBidi" w:cstheme="majorBidi"/>
+          <w:sz w:val="28"/>
+          <w:szCs w:val="28"/>
+        </w:rPr>
+      </w:pPr>
+      <w:r>
+        <w:rPr>
+          <w:rFonts w:asciiTheme="majorBidi" w:hAnsiTheme="majorBidi" w:cstheme="majorBidi"/>
+          <w:sz w:val="28"/>
+          <w:szCs w:val="28"/>
+        </w:rPr>
+        <w:t>task execution crashes</w:t>
+      </w:r>
+    </w:p>
+    <w:p>
+      <w:pPr>
+        <w:pStyle w:val="ListParagraph"/>
+        <w:numPr>
+          <w:ilvl w:val="0"/>
+          <w:numId w:val="53"/>
+        </w:numPr>
+        <w:jc w:val="both"/>
+        <w:rPr>
+          <w:rFonts w:asciiTheme="majorBidi" w:hAnsiTheme="majorBidi" w:cstheme="majorBidi"/>
+          <w:sz w:val="28"/>
+          <w:szCs w:val="28"/>
+        </w:rPr>
+      </w:pPr>
+      <w:r>
+        <w:rPr>
+          <w:rFonts w:asciiTheme="majorBidi" w:hAnsiTheme="majorBidi" w:cstheme="majorBidi"/>
+          <w:sz w:val="28"/>
+          <w:szCs w:val="28"/>
+        </w:rPr>
+        <w:t>connection drops</w:t>
+      </w:r>
+    </w:p>
+    <w:p>
+      <w:pPr>
+        <w:pStyle w:val="ListParagraph"/>
+        <w:numPr>
+          <w:ilvl w:val="0"/>
+          <w:numId w:val="53"/>
+        </w:numPr>
+        <w:jc w:val="both"/>
+        <w:rPr>
+          <w:rFonts w:asciiTheme="majorBidi" w:hAnsiTheme="majorBidi" w:cstheme="majorBidi"/>
+          <w:sz w:val="28"/>
+          <w:szCs w:val="28"/>
+        </w:rPr>
+      </w:pPr>
+      <w:r>
+        <w:rPr>
+          <w:rFonts w:asciiTheme="majorBidi" w:hAnsiTheme="majorBidi" w:cstheme="majorBidi"/>
+          <w:sz w:val="28"/>
+          <w:szCs w:val="28"/>
+        </w:rPr>
+        <w:t>cleanup step fails</w:t>
+      </w:r>
+    </w:p>
+    <w:p>
+      <w:pPr>
+        <w:pStyle w:val="ListParagraph"/>
+        <w:numPr>
+          <w:ilvl w:val="0"/>
+          <w:numId w:val="53"/>
+        </w:numPr>
+        <w:spacing w:after="60"/>
+        <w:jc w:val="both"/>
+        <w:rPr>
+          <w:rFonts w:asciiTheme="majorBidi" w:hAnsiTheme="majorBidi" w:cstheme="majorBidi"/>
+          <w:sz w:val="28"/>
+          <w:szCs w:val="28"/>
+        </w:rPr>
+      </w:pPr>
+      <w:r>
+        <w:rPr>
+          <w:rFonts w:asciiTheme="majorBidi" w:hAnsiTheme="majorBidi" w:cstheme="majorBidi"/>
+          <w:sz w:val="28"/>
+          <w:szCs w:val="28"/>
+        </w:rPr>
+        <w:t>debugging options intentionally preserve files</w:t>
+      </w:r>
+    </w:p>
+    <w:p>
+      <w:pPr>
+        <w:spacing w:after="80"/>
+        <w:ind w:left="360"/>
+        <w:jc w:val="both"/>
+        <w:rPr>
+          <w:rFonts w:asciiTheme="majorBidi" w:hAnsiTheme="majorBidi" w:cstheme="majorBidi"/>
+          <w:sz w:val="28"/>
+          <w:szCs w:val="28"/>
+        </w:rPr>
+      </w:pPr>
+      <w:proofErr w:type="gramStart"/>
+      <w:r>
+        <w:rPr>
+          <w:rFonts w:asciiTheme="majorBidi" w:hAnsiTheme="majorBidi" w:cstheme="majorBidi"/>
+          <w:sz w:val="28"/>
+          <w:szCs w:val="28"/>
+        </w:rPr>
+        <w:lastRenderedPageBreak/>
+        <w:t>So</w:t>
+      </w:r>
+      <w:proofErr w:type="gramEnd"/>
+      <w:r>
+        <w:rPr>
+          <w:rFonts w:asciiTheme="majorBidi" w:hAnsiTheme="majorBidi" w:cstheme="majorBidi"/>
+          <w:sz w:val="28"/>
+          <w:szCs w:val="28"/>
+        </w:rPr>
+        <w:t xml:space="preserve"> in practice, cleanup is the normal behavior, but not an absolute guarantee in every failure scenario.</w:t>
+      </w:r>
+    </w:p>
+    <w:p>
+      <w:pPr>
+        <w:jc w:val="both"/>
+        <w:rPr>
+          <w:rFonts w:asciiTheme="majorBidi" w:hAnsiTheme="majorBidi" w:cstheme="majorBidi"/>
+          <w:sz w:val="28"/>
+          <w:szCs w:val="28"/>
+        </w:rPr>
+      </w:pPr>
+      <w:r>
+        <w:rPr>
+          <w:rFonts w:asciiTheme="majorBidi" w:hAnsiTheme="majorBidi" w:cstheme="majorBidi"/>
+          <w:sz w:val="28"/>
+          <w:szCs w:val="28"/>
+        </w:rPr>
+        <w:t>Ansible usually copies modules to a temporary location on the managed node, executes them, retrieves the result, and then removes the temporary module files. Cleanup is normally automatic, though temporary files may remain in some failure/debug scenarios.</w:t>
+      </w:r>
     </w:p>
     <w:p>
       <w:pPr>
@@ -16608,8 +16786,121 @@
 </file>
 
 <file path=word/numbering.xml><?xml version="1.0" encoding="utf-8"?>
-<w:numbering xmlns:wpc="http://schemas.microsoft.com/office/word/2010/wordprocessingCanvas" xmlns:cx="http://schemas.microsoft.com/office/drawing/2014/chartex" xmlns:cx1="http://schemas.microsoft.com/office/drawing/2015/9/8/chartex" xmlns:cx2="http://schemas.microsoft.com/office/drawing/2015/10/21/chartex" xmlns:cx3="http://schemas.microsoft.com/office/drawing/2016/5/9/chartex" xmlns:cx4="http://schemas.microsoft.com/office/drawing/2016/5/10/chartex" xmlns:cx5="http://schemas.microsoft.com/office/drawing/2016/5/11/chartex" xmlns:cx6="http://schemas.microsoft.com/office/drawing/2016/5/12/chartex" xmlns:cx7="http://schemas.microsoft.com/office/drawing/2016/5/13/chartex" xmlns:cx8="http://schemas.microsoft.com/office/drawing/2016/5/14/chartex" xmlns:mc="http://schemas.openxmlformats.org/markup-compatibility/2006" xmlns:aink="http://schemas.microsoft.com/office/drawing/2016/ink" xmlns:am3d="http://schemas.microsoft.com/office/drawing/2017/model3d" xmlns:o="urn:schemas-microsoft-com:office:office" xmlns:oel="http://schemas.microsoft.com/office/2019/extlst" xmlns:r="http://schemas.openxmlformats.org/officeDocument/2006/relationships" xmlns:m="http://schemas.openxmlformats.org/officeDocument/2006/math" xmlns:v="urn:schemas-microsoft-com:vml" xmlns:wp14="http://schemas.microsoft.com/office/word/2010/wordprocessingDrawing" xmlns:wp="http://schemas.openxmlformats.org/drawingml/2006/wordprocessingDrawing" xmlns:w10="urn:schemas-microsoft-com:office:word" xmlns:w="http://schemas.openxmlformats.org/wordprocessingml/2006/main" xmlns:w14="http://schemas.microsoft.com/office/word/2010/wordml" xmlns:w15="http://schemas.microsoft.com/office/word/2012/wordml" xmlns:w16cex="http://schemas.microsoft.com/office/word/2018/wordml/cex" xmlns:w16cid="http://schemas.microsoft.com/office/word/2016/wordml/cid" xmlns:w16="http://schemas.microsoft.com/office/word/2018/wordml" xmlns:w16sdtdh="http://schemas.microsoft.com/office/word/2020/wordml/sdtdatahash" xmlns:w16se="http://schemas.microsoft.com/office/word/2015/wordml/symex" xmlns:wpg="http://schemas.microsoft.com/office/word/2010/wordprocessingGroup" xmlns:wpi="http://schemas.microsoft.com/office/word/2010/wordprocessingInk" xmlns:wne="http://schemas.microsoft.com/office/word/2006/wordml" xmlns:wps="http://schemas.microsoft.com/office/word/2010/wordprocessingShape" mc:Ignorable="w14 w15 w16se w16cid w16 w16cex w16sdtdh wp14">
+<w:numbering xmlns:wpc="http://schemas.microsoft.com/office/word/2010/wordprocessingCanvas" xmlns:cx="http://schemas.microsoft.com/office/drawing/2014/chartex" xmlns:cx1="http://schemas.microsoft.com/office/drawing/2015/9/8/chartex" xmlns:cx2="http://schemas.microsoft.com/office/drawing/2015/10/21/chartex" xmlns:cx3="http://schemas.microsoft.com/office/drawing/2016/5/9/chartex" xmlns:cx4="http://schemas.microsoft.com/office/drawing/2016/5/10/chartex" xmlns:cx5="http://schemas.microsoft.com/office/drawing/2016/5/11/chartex" xmlns:cx6="http://schemas.microsoft.com/office/drawing/2016/5/12/chartex" xmlns:cx7="http://schemas.microsoft.com/office/drawing/2016/5/13/chartex" xmlns:cx8="http://schemas.microsoft.com/office/drawing/2016/5/14/chartex" xmlns:mc="http://schemas.openxmlformats.org/markup-compatibility/2006" xmlns:aink="http://schemas.microsoft.com/office/drawing/2016/ink" xmlns:am3d="http://schemas.microsoft.com/office/drawing/2017/model3d" xmlns:o="urn:schemas-microsoft-com:office:office" xmlns:oel="http://schemas.microsoft.com/office/2019/extlst" xmlns:r="http://schemas.openxmlformats.org/officeDocument/2006/relationships" xmlns:m="http://schemas.openxmlformats.org/officeDocument/2006/math" xmlns:v="urn:schemas-microsoft-com:vml" xmlns:wp14="http://schemas.microsoft.com/office/word/2010/wordprocessingDrawing" xmlns:wp="http://schemas.openxmlformats.org/drawingml/2006/wordprocessingDrawing" xmlns:w10="urn:schemas-microsoft-com:office:word" xmlns:w="http://schemas.openxmlformats.org/wordprocessingml/2006/main" xmlns:w14="http://schemas.microsoft.com/office/word/2010/wordml" xmlns:w15="http://schemas.microsoft.com/office/word/2012/wordml" xmlns:w16cex="http://schemas.microsoft.com/office/word/2018/wordml/cex" xmlns:w16cid="http://schemas.microsoft.com/office/word/2016/wordml/cid" xmlns:w16="http://schemas.microsoft.com/office/word/2018/wordml" xmlns:w16du="http://schemas.microsoft.com/office/word/2023/wordml/word16du" xmlns:w16sdtdh="http://schemas.microsoft.com/office/word/2020/wordml/sdtdatahash" xmlns:w16sdtfl="http://schemas.microsoft.com/office/word/2024/wordml/sdtformatlock" xmlns:w16se="http://schemas.microsoft.com/office/word/2015/wordml/symex" xmlns:wpg="http://schemas.microsoft.com/office/word/2010/wordprocessingGroup" xmlns:wpi="http://schemas.microsoft.com/office/word/2010/wordprocessingInk" xmlns:wne="http://schemas.microsoft.com/office/word/2006/wordml" xmlns:wps="http://schemas.microsoft.com/office/word/2010/wordprocessingShape" mc:Ignorable="w14 w15 w16se w16cid w16 w16cex w16sdtdh w16sdtfl w16du wp14">
   <w:abstractNum w:abstractNumId="0" w15:restartNumberingAfterBreak="0">
+    <w:nsid w:val="06E66157"/>
+    <w:multiLevelType w:val="hybridMultilevel"/>
+    <w:tmpl w:val="0508807C"/>
+    <w:lvl w:ilvl="0" w:tplc="04090001">
+      <w:start w:val="1"/>
+      <w:numFmt w:val="bullet"/>
+      <w:lvlText w:val=""/>
+      <w:lvlJc w:val="left"/>
+      <w:pPr>
+        <w:ind w:left="720" w:hanging="360"/>
+      </w:pPr>
+      <w:rPr>
+        <w:rFonts w:ascii="Symbol" w:hAnsi="Symbol" w:hint="default"/>
+      </w:rPr>
+    </w:lvl>
+    <w:lvl w:ilvl="1" w:tplc="04090003" w:tentative="1">
+      <w:start w:val="1"/>
+      <w:numFmt w:val="bullet"/>
+      <w:lvlText w:val="o"/>
+      <w:lvlJc w:val="left"/>
+      <w:pPr>
+        <w:ind w:left="1440" w:hanging="360"/>
+      </w:pPr>
+      <w:rPr>
+        <w:rFonts w:ascii="Courier New" w:hAnsi="Courier New" w:cs="Courier New" w:hint="default"/>
+      </w:rPr>
+    </w:lvl>
+    <w:lvl w:ilvl="2" w:tplc="04090005" w:tentative="1">
+      <w:start w:val="1"/>
+      <w:numFmt w:val="bullet"/>
+      <w:lvlText w:val=""/>
+      <w:lvlJc w:val="left"/>
+      <w:pPr>
+        <w:ind w:left="2160" w:hanging="360"/>
+      </w:pPr>
+      <w:rPr>
+        <w:rFonts w:ascii="Wingdings" w:hAnsi="Wingdings" w:hint="default"/>
+      </w:rPr>
+    </w:lvl>
+    <w:lvl w:ilvl="3" w:tplc="04090001" w:tentative="1">
+      <w:start w:val="1"/>
+      <w:numFmt w:val="bullet"/>
+      <w:lvlText w:val=""/>
+      <w:lvlJc w:val="left"/>
+      <w:pPr>
+        <w:ind w:left="2880" w:hanging="360"/>
+      </w:pPr>
+      <w:rPr>
+        <w:rFonts w:ascii="Symbol" w:hAnsi="Symbol" w:hint="default"/>
+      </w:rPr>
+    </w:lvl>
+    <w:lvl w:ilvl="4" w:tplc="04090003" w:tentative="1">
+      <w:start w:val="1"/>
+      <w:numFmt w:val="bullet"/>
+      <w:lvlText w:val="o"/>
+      <w:lvlJc w:val="left"/>
+      <w:pPr>
+        <w:ind w:left="3600" w:hanging="360"/>
+      </w:pPr>
+      <w:rPr>
+        <w:rFonts w:ascii="Courier New" w:hAnsi="Courier New" w:cs="Courier New" w:hint="default"/>
+      </w:rPr>
+    </w:lvl>
+    <w:lvl w:ilvl="5" w:tplc="04090005" w:tentative="1">
+      <w:start w:val="1"/>
+      <w:numFmt w:val="bullet"/>
+      <w:lvlText w:val=""/>
+      <w:lvlJc w:val="left"/>
+      <w:pPr>
+        <w:ind w:left="4320" w:hanging="360"/>
+      </w:pPr>
+      <w:rPr>
+        <w:rFonts w:ascii="Wingdings" w:hAnsi="Wingdings" w:hint="default"/>
+      </w:rPr>
+    </w:lvl>
+    <w:lvl w:ilvl="6" w:tplc="04090001" w:tentative="1">
+      <w:start w:val="1"/>
+      <w:numFmt w:val="bullet"/>
+      <w:lvlText w:val=""/>
+      <w:lvlJc w:val="left"/>
+      <w:pPr>
+        <w:ind w:left="5040" w:hanging="360"/>
+      </w:pPr>
+      <w:rPr>
+        <w:rFonts w:ascii="Symbol" w:hAnsi="Symbol" w:hint="default"/>
+      </w:rPr>
+    </w:lvl>
+    <w:lvl w:ilvl="7" w:tplc="04090003" w:tentative="1">
+      <w:start w:val="1"/>
+      <w:numFmt w:val="bullet"/>
+      <w:lvlText w:val="o"/>
+      <w:lvlJc w:val="left"/>
+      <w:pPr>
+        <w:ind w:left="5760" w:hanging="360"/>
+      </w:pPr>
+      <w:rPr>
+        <w:rFonts w:ascii="Courier New" w:hAnsi="Courier New" w:cs="Courier New" w:hint="default"/>
+      </w:rPr>
+    </w:lvl>
+    <w:lvl w:ilvl="8" w:tplc="04090005" w:tentative="1">
+      <w:start w:val="1"/>
+      <w:numFmt w:val="bullet"/>
+      <w:lvlText w:val=""/>
+      <w:lvlJc w:val="left"/>
+      <w:pPr>
+        <w:ind w:left="6480" w:hanging="360"/>
+      </w:pPr>
+      <w:rPr>
+        <w:rFonts w:ascii="Wingdings" w:hAnsi="Wingdings" w:hint="default"/>
+      </w:rPr>
+    </w:lvl>
+  </w:abstractNum>
+  <w:abstractNum w:abstractNumId="1" w15:restartNumberingAfterBreak="0">
     <w:nsid w:val="07FF716E"/>
     <w:multiLevelType w:val="hybridMultilevel"/>
     <w:tmpl w:val="C6CE4432"/>
@@ -16722,7 +17013,7 @@
       </w:rPr>
     </w:lvl>
   </w:abstractNum>
-  <w:abstractNum w:abstractNumId="1" w15:restartNumberingAfterBreak="0">
+  <w:abstractNum w:abstractNumId="2" w15:restartNumberingAfterBreak="0">
     <w:nsid w:val="0A620700"/>
     <w:multiLevelType w:val="hybridMultilevel"/>
     <w:tmpl w:val="3DE6086C"/>
@@ -16835,7 +17126,7 @@
       </w:rPr>
     </w:lvl>
   </w:abstractNum>
-  <w:abstractNum w:abstractNumId="2" w15:restartNumberingAfterBreak="0">
+  <w:abstractNum w:abstractNumId="3" w15:restartNumberingAfterBreak="0">
     <w:nsid w:val="0DC8673A"/>
     <w:multiLevelType w:val="hybridMultilevel"/>
     <w:tmpl w:val="F02A26F6"/>
@@ -16948,7 +17239,7 @@
       </w:rPr>
     </w:lvl>
   </w:abstractNum>
-  <w:abstractNum w:abstractNumId="3" w15:restartNumberingAfterBreak="0">
+  <w:abstractNum w:abstractNumId="4" w15:restartNumberingAfterBreak="0">
     <w:nsid w:val="10983F30"/>
     <w:multiLevelType w:val="hybridMultilevel"/>
     <w:tmpl w:val="F2C05EE6"/>
@@ -17034,7 +17325,7 @@
       </w:pPr>
     </w:lvl>
   </w:abstractNum>
-  <w:abstractNum w:abstractNumId="4" w15:restartNumberingAfterBreak="0">
+  <w:abstractNum w:abstractNumId="5" w15:restartNumberingAfterBreak="0">
     <w:nsid w:val="14ED6D17"/>
     <w:multiLevelType w:val="hybridMultilevel"/>
     <w:tmpl w:val="92E877AE"/>
@@ -17147,7 +17438,7 @@
       </w:rPr>
     </w:lvl>
   </w:abstractNum>
-  <w:abstractNum w:abstractNumId="5" w15:restartNumberingAfterBreak="0">
+  <w:abstractNum w:abstractNumId="6" w15:restartNumberingAfterBreak="0">
     <w:nsid w:val="16DA66F1"/>
     <w:multiLevelType w:val="hybridMultilevel"/>
     <w:tmpl w:val="C63EE6FE"/>
@@ -17260,7 +17551,7 @@
       </w:rPr>
     </w:lvl>
   </w:abstractNum>
-  <w:abstractNum w:abstractNumId="6" w15:restartNumberingAfterBreak="0">
+  <w:abstractNum w:abstractNumId="7" w15:restartNumberingAfterBreak="0">
     <w:nsid w:val="186472A9"/>
     <w:multiLevelType w:val="hybridMultilevel"/>
     <w:tmpl w:val="3D6825C4"/>
@@ -17373,7 +17664,7 @@
       </w:rPr>
     </w:lvl>
   </w:abstractNum>
-  <w:abstractNum w:abstractNumId="7" w15:restartNumberingAfterBreak="0">
+  <w:abstractNum w:abstractNumId="8" w15:restartNumberingAfterBreak="0">
     <w:nsid w:val="1CAF0F5B"/>
     <w:multiLevelType w:val="hybridMultilevel"/>
     <w:tmpl w:val="7B948142"/>
@@ -17486,7 +17777,7 @@
       </w:rPr>
     </w:lvl>
   </w:abstractNum>
-  <w:abstractNum w:abstractNumId="8" w15:restartNumberingAfterBreak="0">
+  <w:abstractNum w:abstractNumId="9" w15:restartNumberingAfterBreak="0">
     <w:nsid w:val="20BE5315"/>
     <w:multiLevelType w:val="hybridMultilevel"/>
     <w:tmpl w:val="17883896"/>
@@ -17599,7 +17890,7 @@
       </w:rPr>
     </w:lvl>
   </w:abstractNum>
-  <w:abstractNum w:abstractNumId="9" w15:restartNumberingAfterBreak="0">
+  <w:abstractNum w:abstractNumId="10" w15:restartNumberingAfterBreak="0">
     <w:nsid w:val="21C42206"/>
     <w:multiLevelType w:val="hybridMultilevel"/>
     <w:tmpl w:val="EEE08DB8"/>
@@ -17712,7 +18003,7 @@
       </w:rPr>
     </w:lvl>
   </w:abstractNum>
-  <w:abstractNum w:abstractNumId="10" w15:restartNumberingAfterBreak="0">
+  <w:abstractNum w:abstractNumId="11" w15:restartNumberingAfterBreak="0">
     <w:nsid w:val="2B8E2D77"/>
     <w:multiLevelType w:val="hybridMultilevel"/>
     <w:tmpl w:val="E0F81140"/>
@@ -17825,7 +18116,346 @@
       </w:rPr>
     </w:lvl>
   </w:abstractNum>
-  <w:abstractNum w:abstractNumId="11" w15:restartNumberingAfterBreak="0">
+  <w:abstractNum w:abstractNumId="12" w15:restartNumberingAfterBreak="0">
+    <w:nsid w:val="2C8D6A0E"/>
+    <w:multiLevelType w:val="hybridMultilevel"/>
+    <w:tmpl w:val="B184BBE2"/>
+    <w:lvl w:ilvl="0" w:tplc="04090001">
+      <w:start w:val="1"/>
+      <w:numFmt w:val="bullet"/>
+      <w:lvlText w:val=""/>
+      <w:lvlJc w:val="left"/>
+      <w:pPr>
+        <w:ind w:left="720" w:hanging="360"/>
+      </w:pPr>
+      <w:rPr>
+        <w:rFonts w:ascii="Symbol" w:hAnsi="Symbol" w:hint="default"/>
+      </w:rPr>
+    </w:lvl>
+    <w:lvl w:ilvl="1" w:tplc="04090003" w:tentative="1">
+      <w:start w:val="1"/>
+      <w:numFmt w:val="bullet"/>
+      <w:lvlText w:val="o"/>
+      <w:lvlJc w:val="left"/>
+      <w:pPr>
+        <w:ind w:left="1440" w:hanging="360"/>
+      </w:pPr>
+      <w:rPr>
+        <w:rFonts w:ascii="Courier New" w:hAnsi="Courier New" w:cs="Courier New" w:hint="default"/>
+      </w:rPr>
+    </w:lvl>
+    <w:lvl w:ilvl="2" w:tplc="04090005" w:tentative="1">
+      <w:start w:val="1"/>
+      <w:numFmt w:val="bullet"/>
+      <w:lvlText w:val=""/>
+      <w:lvlJc w:val="left"/>
+      <w:pPr>
+        <w:ind w:left="2160" w:hanging="360"/>
+      </w:pPr>
+      <w:rPr>
+        <w:rFonts w:ascii="Wingdings" w:hAnsi="Wingdings" w:hint="default"/>
+      </w:rPr>
+    </w:lvl>
+    <w:lvl w:ilvl="3" w:tplc="04090001" w:tentative="1">
+      <w:start w:val="1"/>
+      <w:numFmt w:val="bullet"/>
+      <w:lvlText w:val=""/>
+      <w:lvlJc w:val="left"/>
+      <w:pPr>
+        <w:ind w:left="2880" w:hanging="360"/>
+      </w:pPr>
+      <w:rPr>
+        <w:rFonts w:ascii="Symbol" w:hAnsi="Symbol" w:hint="default"/>
+      </w:rPr>
+    </w:lvl>
+    <w:lvl w:ilvl="4" w:tplc="04090003" w:tentative="1">
+      <w:start w:val="1"/>
+      <w:numFmt w:val="bullet"/>
+      <w:lvlText w:val="o"/>
+      <w:lvlJc w:val="left"/>
+      <w:pPr>
+        <w:ind w:left="3600" w:hanging="360"/>
+      </w:pPr>
+      <w:rPr>
+        <w:rFonts w:ascii="Courier New" w:hAnsi="Courier New" w:cs="Courier New" w:hint="default"/>
+      </w:rPr>
+    </w:lvl>
+    <w:lvl w:ilvl="5" w:tplc="04090005" w:tentative="1">
+      <w:start w:val="1"/>
+      <w:numFmt w:val="bullet"/>
+      <w:lvlText w:val=""/>
+      <w:lvlJc w:val="left"/>
+      <w:pPr>
+        <w:ind w:left="4320" w:hanging="360"/>
+      </w:pPr>
+      <w:rPr>
+        <w:rFonts w:ascii="Wingdings" w:hAnsi="Wingdings" w:hint="default"/>
+      </w:rPr>
+    </w:lvl>
+    <w:lvl w:ilvl="6" w:tplc="04090001" w:tentative="1">
+      <w:start w:val="1"/>
+      <w:numFmt w:val="bullet"/>
+      <w:lvlText w:val=""/>
+      <w:lvlJc w:val="left"/>
+      <w:pPr>
+        <w:ind w:left="5040" w:hanging="360"/>
+      </w:pPr>
+      <w:rPr>
+        <w:rFonts w:ascii="Symbol" w:hAnsi="Symbol" w:hint="default"/>
+      </w:rPr>
+    </w:lvl>
+    <w:lvl w:ilvl="7" w:tplc="04090003" w:tentative="1">
+      <w:start w:val="1"/>
+      <w:numFmt w:val="bullet"/>
+      <w:lvlText w:val="o"/>
+      <w:lvlJc w:val="left"/>
+      <w:pPr>
+        <w:ind w:left="5760" w:hanging="360"/>
+      </w:pPr>
+      <w:rPr>
+        <w:rFonts w:ascii="Courier New" w:hAnsi="Courier New" w:cs="Courier New" w:hint="default"/>
+      </w:rPr>
+    </w:lvl>
+    <w:lvl w:ilvl="8" w:tplc="04090005" w:tentative="1">
+      <w:start w:val="1"/>
+      <w:numFmt w:val="bullet"/>
+      <w:lvlText w:val=""/>
+      <w:lvlJc w:val="left"/>
+      <w:pPr>
+        <w:ind w:left="6480" w:hanging="360"/>
+      </w:pPr>
+      <w:rPr>
+        <w:rFonts w:ascii="Wingdings" w:hAnsi="Wingdings" w:hint="default"/>
+      </w:rPr>
+    </w:lvl>
+  </w:abstractNum>
+  <w:abstractNum w:abstractNumId="13" w15:restartNumberingAfterBreak="0">
+    <w:nsid w:val="2D1E1659"/>
+    <w:multiLevelType w:val="hybridMultilevel"/>
+    <w:tmpl w:val="03948974"/>
+    <w:lvl w:ilvl="0" w:tplc="04090003">
+      <w:start w:val="1"/>
+      <w:numFmt w:val="bullet"/>
+      <w:lvlText w:val="o"/>
+      <w:lvlJc w:val="left"/>
+      <w:pPr>
+        <w:ind w:left="720" w:hanging="360"/>
+      </w:pPr>
+      <w:rPr>
+        <w:rFonts w:ascii="Courier New" w:hAnsi="Courier New" w:cs="Courier New" w:hint="default"/>
+      </w:rPr>
+    </w:lvl>
+    <w:lvl w:ilvl="1" w:tplc="04090003" w:tentative="1">
+      <w:start w:val="1"/>
+      <w:numFmt w:val="bullet"/>
+      <w:lvlText w:val="o"/>
+      <w:lvlJc w:val="left"/>
+      <w:pPr>
+        <w:ind w:left="1440" w:hanging="360"/>
+      </w:pPr>
+      <w:rPr>
+        <w:rFonts w:ascii="Courier New" w:hAnsi="Courier New" w:cs="Courier New" w:hint="default"/>
+      </w:rPr>
+    </w:lvl>
+    <w:lvl w:ilvl="2" w:tplc="04090005" w:tentative="1">
+      <w:start w:val="1"/>
+      <w:numFmt w:val="bullet"/>
+      <w:lvlText w:val=""/>
+      <w:lvlJc w:val="left"/>
+      <w:pPr>
+        <w:ind w:left="2160" w:hanging="360"/>
+      </w:pPr>
+      <w:rPr>
+        <w:rFonts w:ascii="Wingdings" w:hAnsi="Wingdings" w:hint="default"/>
+      </w:rPr>
+    </w:lvl>
+    <w:lvl w:ilvl="3" w:tplc="04090001" w:tentative="1">
+      <w:start w:val="1"/>
+      <w:numFmt w:val="bullet"/>
+      <w:lvlText w:val=""/>
+      <w:lvlJc w:val="left"/>
+      <w:pPr>
+        <w:ind w:left="2880" w:hanging="360"/>
+      </w:pPr>
+      <w:rPr>
+        <w:rFonts w:ascii="Symbol" w:hAnsi="Symbol" w:hint="default"/>
+      </w:rPr>
+    </w:lvl>
+    <w:lvl w:ilvl="4" w:tplc="04090003" w:tentative="1">
+      <w:start w:val="1"/>
+      <w:numFmt w:val="bullet"/>
+      <w:lvlText w:val="o"/>
+      <w:lvlJc w:val="left"/>
+      <w:pPr>
+        <w:ind w:left="3600" w:hanging="360"/>
+      </w:pPr>
+      <w:rPr>
+        <w:rFonts w:ascii="Courier New" w:hAnsi="Courier New" w:cs="Courier New" w:hint="default"/>
+      </w:rPr>
+    </w:lvl>
+    <w:lvl w:ilvl="5" w:tplc="04090005" w:tentative="1">
+      <w:start w:val="1"/>
+      <w:numFmt w:val="bullet"/>
+      <w:lvlText w:val=""/>
+      <w:lvlJc w:val="left"/>
+      <w:pPr>
+        <w:ind w:left="4320" w:hanging="360"/>
+      </w:pPr>
+      <w:rPr>
+        <w:rFonts w:ascii="Wingdings" w:hAnsi="Wingdings" w:hint="default"/>
+      </w:rPr>
+    </w:lvl>
+    <w:lvl w:ilvl="6" w:tplc="04090001" w:tentative="1">
+      <w:start w:val="1"/>
+      <w:numFmt w:val="bullet"/>
+      <w:lvlText w:val=""/>
+      <w:lvlJc w:val="left"/>
+      <w:pPr>
+        <w:ind w:left="5040" w:hanging="360"/>
+      </w:pPr>
+      <w:rPr>
+        <w:rFonts w:ascii="Symbol" w:hAnsi="Symbol" w:hint="default"/>
+      </w:rPr>
+    </w:lvl>
+    <w:lvl w:ilvl="7" w:tplc="04090003" w:tentative="1">
+      <w:start w:val="1"/>
+      <w:numFmt w:val="bullet"/>
+      <w:lvlText w:val="o"/>
+      <w:lvlJc w:val="left"/>
+      <w:pPr>
+        <w:ind w:left="5760" w:hanging="360"/>
+      </w:pPr>
+      <w:rPr>
+        <w:rFonts w:ascii="Courier New" w:hAnsi="Courier New" w:cs="Courier New" w:hint="default"/>
+      </w:rPr>
+    </w:lvl>
+    <w:lvl w:ilvl="8" w:tplc="04090005" w:tentative="1">
+      <w:start w:val="1"/>
+      <w:numFmt w:val="bullet"/>
+      <w:lvlText w:val=""/>
+      <w:lvlJc w:val="left"/>
+      <w:pPr>
+        <w:ind w:left="6480" w:hanging="360"/>
+      </w:pPr>
+      <w:rPr>
+        <w:rFonts w:ascii="Wingdings" w:hAnsi="Wingdings" w:hint="default"/>
+      </w:rPr>
+    </w:lvl>
+  </w:abstractNum>
+  <w:abstractNum w:abstractNumId="14" w15:restartNumberingAfterBreak="0">
+    <w:nsid w:val="3044693F"/>
+    <w:multiLevelType w:val="hybridMultilevel"/>
+    <w:tmpl w:val="D6925EF0"/>
+    <w:lvl w:ilvl="0" w:tplc="04090001">
+      <w:start w:val="1"/>
+      <w:numFmt w:val="bullet"/>
+      <w:lvlText w:val=""/>
+      <w:lvlJc w:val="left"/>
+      <w:pPr>
+        <w:ind w:left="720" w:hanging="360"/>
+      </w:pPr>
+      <w:rPr>
+        <w:rFonts w:ascii="Symbol" w:hAnsi="Symbol" w:hint="default"/>
+      </w:rPr>
+    </w:lvl>
+    <w:lvl w:ilvl="1" w:tplc="04090003" w:tentative="1">
+      <w:start w:val="1"/>
+      <w:numFmt w:val="bullet"/>
+      <w:lvlText w:val="o"/>
+      <w:lvlJc w:val="left"/>
+      <w:pPr>
+        <w:ind w:left="1440" w:hanging="360"/>
+      </w:pPr>
+      <w:rPr>
+        <w:rFonts w:ascii="Courier New" w:hAnsi="Courier New" w:cs="Courier New" w:hint="default"/>
+      </w:rPr>
+    </w:lvl>
+    <w:lvl w:ilvl="2" w:tplc="04090005" w:tentative="1">
+      <w:start w:val="1"/>
+      <w:numFmt w:val="bullet"/>
+      <w:lvlText w:val=""/>
+      <w:lvlJc w:val="left"/>
+      <w:pPr>
+        <w:ind w:left="2160" w:hanging="360"/>
+      </w:pPr>
+      <w:rPr>
+        <w:rFonts w:ascii="Wingdings" w:hAnsi="Wingdings" w:hint="default"/>
+      </w:rPr>
+    </w:lvl>
+    <w:lvl w:ilvl="3" w:tplc="04090001" w:tentative="1">
+      <w:start w:val="1"/>
+      <w:numFmt w:val="bullet"/>
+      <w:lvlText w:val=""/>
+      <w:lvlJc w:val="left"/>
+      <w:pPr>
+        <w:ind w:left="2880" w:hanging="360"/>
+      </w:pPr>
+      <w:rPr>
+        <w:rFonts w:ascii="Symbol" w:hAnsi="Symbol" w:hint="default"/>
+      </w:rPr>
+    </w:lvl>
+    <w:lvl w:ilvl="4" w:tplc="04090003" w:tentative="1">
+      <w:start w:val="1"/>
+      <w:numFmt w:val="bullet"/>
+      <w:lvlText w:val="o"/>
+      <w:lvlJc w:val="left"/>
+      <w:pPr>
+        <w:ind w:left="3600" w:hanging="360"/>
+      </w:pPr>
+      <w:rPr>
+        <w:rFonts w:ascii="Courier New" w:hAnsi="Courier New" w:cs="Courier New" w:hint="default"/>
+      </w:rPr>
+    </w:lvl>
+    <w:lvl w:ilvl="5" w:tplc="04090005" w:tentative="1">
+      <w:start w:val="1"/>
+      <w:numFmt w:val="bullet"/>
+      <w:lvlText w:val=""/>
+      <w:lvlJc w:val="left"/>
+      <w:pPr>
+        <w:ind w:left="4320" w:hanging="360"/>
+      </w:pPr>
+      <w:rPr>
+        <w:rFonts w:ascii="Wingdings" w:hAnsi="Wingdings" w:hint="default"/>
+      </w:rPr>
+    </w:lvl>
+    <w:lvl w:ilvl="6" w:tplc="04090001" w:tentative="1">
+      <w:start w:val="1"/>
+      <w:numFmt w:val="bullet"/>
+      <w:lvlText w:val=""/>
+      <w:lvlJc w:val="left"/>
+      <w:pPr>
+        <w:ind w:left="5040" w:hanging="360"/>
+      </w:pPr>
+      <w:rPr>
+        <w:rFonts w:ascii="Symbol" w:hAnsi="Symbol" w:hint="default"/>
+      </w:rPr>
+    </w:lvl>
+    <w:lvl w:ilvl="7" w:tplc="04090003" w:tentative="1">
+      <w:start w:val="1"/>
+      <w:numFmt w:val="bullet"/>
+      <w:lvlText w:val="o"/>
+      <w:lvlJc w:val="left"/>
+      <w:pPr>
+        <w:ind w:left="5760" w:hanging="360"/>
+      </w:pPr>
+      <w:rPr>
+        <w:rFonts w:ascii="Courier New" w:hAnsi="Courier New" w:cs="Courier New" w:hint="default"/>
+      </w:rPr>
+    </w:lvl>
+    <w:lvl w:ilvl="8" w:tplc="04090005" w:tentative="1">
+      <w:start w:val="1"/>
+      <w:numFmt w:val="bullet"/>
+      <w:lvlText w:val=""/>
+      <w:lvlJc w:val="left"/>
+      <w:pPr>
+        <w:ind w:left="6480" w:hanging="360"/>
+      </w:pPr>
+      <w:rPr>
+        <w:rFonts w:ascii="Wingdings" w:hAnsi="Wingdings" w:hint="default"/>
+      </w:rPr>
+    </w:lvl>
+  </w:abstractNum>
+  <w:abstractNum w:abstractNumId="15" w15:restartNumberingAfterBreak="0">
     <w:nsid w:val="30E87CED"/>
     <w:multiLevelType w:val="hybridMultilevel"/>
     <w:tmpl w:val="EBF2636A"/>
@@ -17938,7 +18568,7 @@
       </w:rPr>
     </w:lvl>
   </w:abstractNum>
-  <w:abstractNum w:abstractNumId="12" w15:restartNumberingAfterBreak="0">
+  <w:abstractNum w:abstractNumId="16" w15:restartNumberingAfterBreak="0">
     <w:nsid w:val="34B707E4"/>
     <w:multiLevelType w:val="hybridMultilevel"/>
     <w:tmpl w:val="A88234D6"/>
@@ -18051,7 +18681,7 @@
       </w:rPr>
     </w:lvl>
   </w:abstractNum>
-  <w:abstractNum w:abstractNumId="13" w15:restartNumberingAfterBreak="0">
+  <w:abstractNum w:abstractNumId="17" w15:restartNumberingAfterBreak="0">
     <w:nsid w:val="35F7069A"/>
     <w:multiLevelType w:val="hybridMultilevel"/>
     <w:tmpl w:val="E2706FFA"/>
@@ -18164,7 +18794,7 @@
       </w:rPr>
     </w:lvl>
   </w:abstractNum>
-  <w:abstractNum w:abstractNumId="14" w15:restartNumberingAfterBreak="0">
+  <w:abstractNum w:abstractNumId="18" w15:restartNumberingAfterBreak="0">
     <w:nsid w:val="36C0265F"/>
     <w:multiLevelType w:val="hybridMultilevel"/>
     <w:tmpl w:val="7F22A9DC"/>
@@ -18277,7 +18907,7 @@
       </w:rPr>
     </w:lvl>
   </w:abstractNum>
-  <w:abstractNum w:abstractNumId="15" w15:restartNumberingAfterBreak="0">
+  <w:abstractNum w:abstractNumId="19" w15:restartNumberingAfterBreak="0">
     <w:nsid w:val="39D43ED2"/>
     <w:multiLevelType w:val="hybridMultilevel"/>
     <w:tmpl w:val="9E92AEC2"/>
@@ -18390,7 +19020,7 @@
       </w:rPr>
     </w:lvl>
   </w:abstractNum>
-  <w:abstractNum w:abstractNumId="16" w15:restartNumberingAfterBreak="0">
+  <w:abstractNum w:abstractNumId="20" w15:restartNumberingAfterBreak="0">
     <w:nsid w:val="3A342A10"/>
     <w:multiLevelType w:val="hybridMultilevel"/>
     <w:tmpl w:val="0B564080"/>
@@ -18479,7 +19109,7 @@
       </w:pPr>
     </w:lvl>
   </w:abstractNum>
-  <w:abstractNum w:abstractNumId="17" w15:restartNumberingAfterBreak="0">
+  <w:abstractNum w:abstractNumId="21" w15:restartNumberingAfterBreak="0">
     <w:nsid w:val="3B5E4724"/>
     <w:multiLevelType w:val="hybridMultilevel"/>
     <w:tmpl w:val="CE2E798E"/>
@@ -18592,7 +19222,7 @@
       </w:rPr>
     </w:lvl>
   </w:abstractNum>
-  <w:abstractNum w:abstractNumId="18" w15:restartNumberingAfterBreak="0">
+  <w:abstractNum w:abstractNumId="22" w15:restartNumberingAfterBreak="0">
     <w:nsid w:val="3BD1028C"/>
     <w:multiLevelType w:val="hybridMultilevel"/>
     <w:tmpl w:val="A6F242BE"/>
@@ -18705,7 +19335,7 @@
       </w:rPr>
     </w:lvl>
   </w:abstractNum>
-  <w:abstractNum w:abstractNumId="19" w15:restartNumberingAfterBreak="0">
+  <w:abstractNum w:abstractNumId="23" w15:restartNumberingAfterBreak="0">
     <w:nsid w:val="411E5D3A"/>
     <w:multiLevelType w:val="hybridMultilevel"/>
     <w:tmpl w:val="8CD69648"/>
@@ -18818,7 +19448,7 @@
       </w:rPr>
     </w:lvl>
   </w:abstractNum>
-  <w:abstractNum w:abstractNumId="20" w15:restartNumberingAfterBreak="0">
+  <w:abstractNum w:abstractNumId="24" w15:restartNumberingAfterBreak="0">
     <w:nsid w:val="41E94631"/>
     <w:multiLevelType w:val="hybridMultilevel"/>
     <w:tmpl w:val="6E24E2AC"/>
@@ -18931,7 +19561,7 @@
       </w:rPr>
     </w:lvl>
   </w:abstractNum>
-  <w:abstractNum w:abstractNumId="21" w15:restartNumberingAfterBreak="0">
+  <w:abstractNum w:abstractNumId="25" w15:restartNumberingAfterBreak="0">
     <w:nsid w:val="45551587"/>
     <w:multiLevelType w:val="hybridMultilevel"/>
     <w:tmpl w:val="3DC88860"/>
@@ -19044,7 +19674,7 @@
       </w:rPr>
     </w:lvl>
   </w:abstractNum>
-  <w:abstractNum w:abstractNumId="22" w15:restartNumberingAfterBreak="0">
+  <w:abstractNum w:abstractNumId="26" w15:restartNumberingAfterBreak="0">
     <w:nsid w:val="48FF2B3D"/>
     <w:multiLevelType w:val="hybridMultilevel"/>
     <w:tmpl w:val="FDFE9034"/>
@@ -19130,7 +19760,7 @@
       </w:pPr>
     </w:lvl>
   </w:abstractNum>
-  <w:abstractNum w:abstractNumId="23" w15:restartNumberingAfterBreak="0">
+  <w:abstractNum w:abstractNumId="27" w15:restartNumberingAfterBreak="0">
     <w:nsid w:val="49DF3F9E"/>
     <w:multiLevelType w:val="hybridMultilevel"/>
     <w:tmpl w:val="8234726E"/>
@@ -19243,7 +19873,7 @@
       </w:rPr>
     </w:lvl>
   </w:abstractNum>
-  <w:abstractNum w:abstractNumId="24" w15:restartNumberingAfterBreak="0">
+  <w:abstractNum w:abstractNumId="28" w15:restartNumberingAfterBreak="0">
     <w:nsid w:val="4C232DD8"/>
     <w:multiLevelType w:val="hybridMultilevel"/>
     <w:tmpl w:val="9B5CC44E"/>
@@ -19356,7 +19986,7 @@
       </w:rPr>
     </w:lvl>
   </w:abstractNum>
-  <w:abstractNum w:abstractNumId="25" w15:restartNumberingAfterBreak="0">
+  <w:abstractNum w:abstractNumId="29" w15:restartNumberingAfterBreak="0">
     <w:nsid w:val="4D656DB5"/>
     <w:multiLevelType w:val="hybridMultilevel"/>
     <w:tmpl w:val="2376B68E"/>
@@ -19469,7 +20099,7 @@
       </w:rPr>
     </w:lvl>
   </w:abstractNum>
-  <w:abstractNum w:abstractNumId="26" w15:restartNumberingAfterBreak="0">
+  <w:abstractNum w:abstractNumId="30" w15:restartNumberingAfterBreak="0">
     <w:nsid w:val="518E0D0F"/>
     <w:multiLevelType w:val="hybridMultilevel"/>
     <w:tmpl w:val="D2D02B8A"/>
@@ -19582,7 +20212,7 @@
       </w:rPr>
     </w:lvl>
   </w:abstractNum>
-  <w:abstractNum w:abstractNumId="27" w15:restartNumberingAfterBreak="0">
+  <w:abstractNum w:abstractNumId="31" w15:restartNumberingAfterBreak="0">
     <w:nsid w:val="52930ABB"/>
     <w:multiLevelType w:val="hybridMultilevel"/>
     <w:tmpl w:val="C454753E"/>
@@ -19695,7 +20325,7 @@
       </w:rPr>
     </w:lvl>
   </w:abstractNum>
-  <w:abstractNum w:abstractNumId="28" w15:restartNumberingAfterBreak="0">
+  <w:abstractNum w:abstractNumId="32" w15:restartNumberingAfterBreak="0">
     <w:nsid w:val="537911AC"/>
     <w:multiLevelType w:val="hybridMultilevel"/>
     <w:tmpl w:val="586EF818"/>
@@ -19808,7 +20438,7 @@
       </w:rPr>
     </w:lvl>
   </w:abstractNum>
-  <w:abstractNum w:abstractNumId="29" w15:restartNumberingAfterBreak="0">
+  <w:abstractNum w:abstractNumId="33" w15:restartNumberingAfterBreak="0">
     <w:nsid w:val="540B675D"/>
     <w:multiLevelType w:val="hybridMultilevel"/>
     <w:tmpl w:val="5D169368"/>
@@ -19921,7 +20551,7 @@
       </w:rPr>
     </w:lvl>
   </w:abstractNum>
-  <w:abstractNum w:abstractNumId="30" w15:restartNumberingAfterBreak="0">
+  <w:abstractNum w:abstractNumId="34" w15:restartNumberingAfterBreak="0">
     <w:nsid w:val="5ADB3CAD"/>
     <w:multiLevelType w:val="hybridMultilevel"/>
     <w:tmpl w:val="1430D6C4"/>
@@ -20034,7 +20664,120 @@
       </w:rPr>
     </w:lvl>
   </w:abstractNum>
-  <w:abstractNum w:abstractNumId="31" w15:restartNumberingAfterBreak="0">
+  <w:abstractNum w:abstractNumId="35" w15:restartNumberingAfterBreak="0">
+    <w:nsid w:val="5F727116"/>
+    <w:multiLevelType w:val="hybridMultilevel"/>
+    <w:tmpl w:val="0868F93A"/>
+    <w:lvl w:ilvl="0" w:tplc="04090003">
+      <w:start w:val="1"/>
+      <w:numFmt w:val="bullet"/>
+      <w:lvlText w:val="o"/>
+      <w:lvlJc w:val="left"/>
+      <w:pPr>
+        <w:ind w:left="720" w:hanging="360"/>
+      </w:pPr>
+      <w:rPr>
+        <w:rFonts w:ascii="Courier New" w:hAnsi="Courier New" w:cs="Courier New" w:hint="default"/>
+      </w:rPr>
+    </w:lvl>
+    <w:lvl w:ilvl="1" w:tplc="FFFFFFFF" w:tentative="1">
+      <w:start w:val="1"/>
+      <w:numFmt w:val="bullet"/>
+      <w:lvlText w:val="o"/>
+      <w:lvlJc w:val="left"/>
+      <w:pPr>
+        <w:ind w:left="1440" w:hanging="360"/>
+      </w:pPr>
+      <w:rPr>
+        <w:rFonts w:ascii="Courier New" w:hAnsi="Courier New" w:cs="Courier New" w:hint="default"/>
+      </w:rPr>
+    </w:lvl>
+    <w:lvl w:ilvl="2" w:tplc="FFFFFFFF" w:tentative="1">
+      <w:start w:val="1"/>
+      <w:numFmt w:val="bullet"/>
+      <w:lvlText w:val=""/>
+      <w:lvlJc w:val="left"/>
+      <w:pPr>
+        <w:ind w:left="2160" w:hanging="360"/>
+      </w:pPr>
+      <w:rPr>
+        <w:rFonts w:ascii="Wingdings" w:hAnsi="Wingdings" w:hint="default"/>
+      </w:rPr>
+    </w:lvl>
+    <w:lvl w:ilvl="3" w:tplc="FFFFFFFF" w:tentative="1">
+      <w:start w:val="1"/>
+      <w:numFmt w:val="bullet"/>
+      <w:lvlText w:val=""/>
+      <w:lvlJc w:val="left"/>
+      <w:pPr>
+        <w:ind w:left="2880" w:hanging="360"/>
+      </w:pPr>
+      <w:rPr>
+        <w:rFonts w:ascii="Symbol" w:hAnsi="Symbol" w:hint="default"/>
+      </w:rPr>
+    </w:lvl>
+    <w:lvl w:ilvl="4" w:tplc="FFFFFFFF" w:tentative="1">
+      <w:start w:val="1"/>
+      <w:numFmt w:val="bullet"/>
+      <w:lvlText w:val="o"/>
+      <w:lvlJc w:val="left"/>
+      <w:pPr>
+        <w:ind w:left="3600" w:hanging="360"/>
+      </w:pPr>
+      <w:rPr>
+        <w:rFonts w:ascii="Courier New" w:hAnsi="Courier New" w:cs="Courier New" w:hint="default"/>
+      </w:rPr>
+    </w:lvl>
+    <w:lvl w:ilvl="5" w:tplc="FFFFFFFF" w:tentative="1">
+      <w:start w:val="1"/>
+      <w:numFmt w:val="bullet"/>
+      <w:lvlText w:val=""/>
+      <w:lvlJc w:val="left"/>
+      <w:pPr>
+        <w:ind w:left="4320" w:hanging="360"/>
+      </w:pPr>
+      <w:rPr>
+        <w:rFonts w:ascii="Wingdings" w:hAnsi="Wingdings" w:hint="default"/>
+      </w:rPr>
+    </w:lvl>
+    <w:lvl w:ilvl="6" w:tplc="FFFFFFFF" w:tentative="1">
+      <w:start w:val="1"/>
+      <w:numFmt w:val="bullet"/>
+      <w:lvlText w:val=""/>
+      <w:lvlJc w:val="left"/>
+      <w:pPr>
+        <w:ind w:left="5040" w:hanging="360"/>
+      </w:pPr>
+      <w:rPr>
+        <w:rFonts w:ascii="Symbol" w:hAnsi="Symbol" w:hint="default"/>
+      </w:rPr>
+    </w:lvl>
+    <w:lvl w:ilvl="7" w:tplc="FFFFFFFF" w:tentative="1">
+      <w:start w:val="1"/>
+      <w:numFmt w:val="bullet"/>
+      <w:lvlText w:val="o"/>
+      <w:lvlJc w:val="left"/>
+      <w:pPr>
+        <w:ind w:left="5760" w:hanging="360"/>
+      </w:pPr>
+      <w:rPr>
+        <w:rFonts w:ascii="Courier New" w:hAnsi="Courier New" w:cs="Courier New" w:hint="default"/>
+      </w:rPr>
+    </w:lvl>
+    <w:lvl w:ilvl="8" w:tplc="FFFFFFFF" w:tentative="1">
+      <w:start w:val="1"/>
+      <w:numFmt w:val="bullet"/>
+      <w:lvlText w:val=""/>
+      <w:lvlJc w:val="left"/>
+      <w:pPr>
+        <w:ind w:left="6480" w:hanging="360"/>
+      </w:pPr>
+      <w:rPr>
+        <w:rFonts w:ascii="Wingdings" w:hAnsi="Wingdings" w:hint="default"/>
+      </w:rPr>
+    </w:lvl>
+  </w:abstractNum>
+  <w:abstractNum w:abstractNumId="36" w15:restartNumberingAfterBreak="0">
     <w:nsid w:val="60170DD7"/>
     <w:multiLevelType w:val="hybridMultilevel"/>
     <w:tmpl w:val="5918645E"/>
@@ -20120,7 +20863,7 @@
       </w:pPr>
     </w:lvl>
   </w:abstractNum>
-  <w:abstractNum w:abstractNumId="32" w15:restartNumberingAfterBreak="0">
+  <w:abstractNum w:abstractNumId="37" w15:restartNumberingAfterBreak="0">
     <w:nsid w:val="6308671C"/>
     <w:multiLevelType w:val="hybridMultilevel"/>
     <w:tmpl w:val="C71872EE"/>
@@ -20233,7 +20976,7 @@
       </w:rPr>
     </w:lvl>
   </w:abstractNum>
-  <w:abstractNum w:abstractNumId="33" w15:restartNumberingAfterBreak="0">
+  <w:abstractNum w:abstractNumId="38" w15:restartNumberingAfterBreak="0">
     <w:nsid w:val="64BA097F"/>
     <w:multiLevelType w:val="hybridMultilevel"/>
     <w:tmpl w:val="EDD6AD74"/>
@@ -20346,7 +21089,7 @@
       </w:rPr>
     </w:lvl>
   </w:abstractNum>
-  <w:abstractNum w:abstractNumId="34" w15:restartNumberingAfterBreak="0">
+  <w:abstractNum w:abstractNumId="39" w15:restartNumberingAfterBreak="0">
     <w:nsid w:val="64BD6D0A"/>
     <w:multiLevelType w:val="hybridMultilevel"/>
     <w:tmpl w:val="E6B2BDCA"/>
@@ -20432,7 +21175,7 @@
       </w:pPr>
     </w:lvl>
   </w:abstractNum>
-  <w:abstractNum w:abstractNumId="35" w15:restartNumberingAfterBreak="0">
+  <w:abstractNum w:abstractNumId="40" w15:restartNumberingAfterBreak="0">
     <w:nsid w:val="66437075"/>
     <w:multiLevelType w:val="hybridMultilevel"/>
     <w:tmpl w:val="E6B2BDCA"/>
@@ -20518,7 +21261,7 @@
       </w:pPr>
     </w:lvl>
   </w:abstractNum>
-  <w:abstractNum w:abstractNumId="36" w15:restartNumberingAfterBreak="0">
+  <w:abstractNum w:abstractNumId="41" w15:restartNumberingAfterBreak="0">
     <w:nsid w:val="665052E3"/>
     <w:multiLevelType w:val="hybridMultilevel"/>
     <w:tmpl w:val="325EA508"/>
@@ -20631,7 +21374,7 @@
       </w:rPr>
     </w:lvl>
   </w:abstractNum>
-  <w:abstractNum w:abstractNumId="37" w15:restartNumberingAfterBreak="0">
+  <w:abstractNum w:abstractNumId="42" w15:restartNumberingAfterBreak="0">
     <w:nsid w:val="6A2F53A7"/>
     <w:multiLevelType w:val="hybridMultilevel"/>
     <w:tmpl w:val="CAEA29EA"/>
@@ -20744,7 +21487,7 @@
       </w:rPr>
     </w:lvl>
   </w:abstractNum>
-  <w:abstractNum w:abstractNumId="38" w15:restartNumberingAfterBreak="0">
+  <w:abstractNum w:abstractNumId="43" w15:restartNumberingAfterBreak="0">
     <w:nsid w:val="6D425B88"/>
     <w:multiLevelType w:val="hybridMultilevel"/>
     <w:tmpl w:val="423C70F2"/>
@@ -20857,7 +21600,7 @@
       </w:rPr>
     </w:lvl>
   </w:abstractNum>
-  <w:abstractNum w:abstractNumId="39" w15:restartNumberingAfterBreak="0">
+  <w:abstractNum w:abstractNumId="44" w15:restartNumberingAfterBreak="0">
     <w:nsid w:val="6ED370E4"/>
     <w:multiLevelType w:val="hybridMultilevel"/>
     <w:tmpl w:val="4DD2FD80"/>
@@ -20970,7 +21713,7 @@
       </w:rPr>
     </w:lvl>
   </w:abstractNum>
-  <w:abstractNum w:abstractNumId="40" w15:restartNumberingAfterBreak="0">
+  <w:abstractNum w:abstractNumId="45" w15:restartNumberingAfterBreak="0">
     <w:nsid w:val="705E1E6D"/>
     <w:multiLevelType w:val="hybridMultilevel"/>
     <w:tmpl w:val="D1FA0640"/>
@@ -21083,7 +21826,7 @@
       </w:rPr>
     </w:lvl>
   </w:abstractNum>
-  <w:abstractNum w:abstractNumId="41" w15:restartNumberingAfterBreak="0">
+  <w:abstractNum w:abstractNumId="46" w15:restartNumberingAfterBreak="0">
     <w:nsid w:val="72266A2A"/>
     <w:multiLevelType w:val="hybridMultilevel"/>
     <w:tmpl w:val="5636BE4C"/>
@@ -21196,7 +21939,7 @@
       </w:rPr>
     </w:lvl>
   </w:abstractNum>
-  <w:abstractNum w:abstractNumId="42" w15:restartNumberingAfterBreak="0">
+  <w:abstractNum w:abstractNumId="47" w15:restartNumberingAfterBreak="0">
     <w:nsid w:val="726732F5"/>
     <w:multiLevelType w:val="hybridMultilevel"/>
     <w:tmpl w:val="1DB29D4E"/>
@@ -21282,7 +22025,7 @@
       </w:pPr>
     </w:lvl>
   </w:abstractNum>
-  <w:abstractNum w:abstractNumId="43" w15:restartNumberingAfterBreak="0">
+  <w:abstractNum w:abstractNumId="48" w15:restartNumberingAfterBreak="0">
     <w:nsid w:val="7681757C"/>
     <w:multiLevelType w:val="hybridMultilevel"/>
     <w:tmpl w:val="B2E0E1E8"/>
@@ -21395,7 +22138,7 @@
       </w:rPr>
     </w:lvl>
   </w:abstractNum>
-  <w:abstractNum w:abstractNumId="44" w15:restartNumberingAfterBreak="0">
+  <w:abstractNum w:abstractNumId="49" w15:restartNumberingAfterBreak="0">
     <w:nsid w:val="76B0003B"/>
     <w:multiLevelType w:val="hybridMultilevel"/>
     <w:tmpl w:val="15D85EF2"/>
@@ -21508,7 +22251,7 @@
       </w:rPr>
     </w:lvl>
   </w:abstractNum>
-  <w:abstractNum w:abstractNumId="45" w15:restartNumberingAfterBreak="0">
+  <w:abstractNum w:abstractNumId="50" w15:restartNumberingAfterBreak="0">
     <w:nsid w:val="791E3FC2"/>
     <w:multiLevelType w:val="hybridMultilevel"/>
     <w:tmpl w:val="771612BC"/>
@@ -21621,7 +22364,7 @@
       </w:rPr>
     </w:lvl>
   </w:abstractNum>
-  <w:abstractNum w:abstractNumId="46" w15:restartNumberingAfterBreak="0">
+  <w:abstractNum w:abstractNumId="51" w15:restartNumberingAfterBreak="0">
     <w:nsid w:val="7B0A7865"/>
     <w:multiLevelType w:val="hybridMultilevel"/>
     <w:tmpl w:val="938832DE"/>
@@ -21707,7 +22450,7 @@
       </w:pPr>
     </w:lvl>
   </w:abstractNum>
-  <w:abstractNum w:abstractNumId="47" w15:restartNumberingAfterBreak="0">
+  <w:abstractNum w:abstractNumId="52" w15:restartNumberingAfterBreak="0">
     <w:nsid w:val="7E2E745E"/>
     <w:multiLevelType w:val="hybridMultilevel"/>
     <w:tmpl w:val="283E29C6"/>
@@ -21821,155 +22564,170 @@
     </w:lvl>
   </w:abstractNum>
   <w:num w:numId="1" w16cid:durableId="1910075662">
+    <w:abstractNumId w:val="46"/>
+  </w:num>
+  <w:num w:numId="2" w16cid:durableId="325256125">
+    <w:abstractNumId w:val="10"/>
+  </w:num>
+  <w:num w:numId="3" w16cid:durableId="1961304762">
+    <w:abstractNumId w:val="37"/>
+  </w:num>
+  <w:num w:numId="4" w16cid:durableId="603266519">
+    <w:abstractNumId w:val="49"/>
+  </w:num>
+  <w:num w:numId="5" w16cid:durableId="1450708912">
+    <w:abstractNumId w:val="52"/>
+  </w:num>
+  <w:num w:numId="6" w16cid:durableId="661199120">
+    <w:abstractNumId w:val="18"/>
+  </w:num>
+  <w:num w:numId="7" w16cid:durableId="140000110">
+    <w:abstractNumId w:val="19"/>
+  </w:num>
+  <w:num w:numId="8" w16cid:durableId="721950120">
+    <w:abstractNumId w:val="3"/>
+  </w:num>
+  <w:num w:numId="9" w16cid:durableId="993992974">
+    <w:abstractNumId w:val="21"/>
+  </w:num>
+  <w:num w:numId="10" w16cid:durableId="1983341953">
+    <w:abstractNumId w:val="23"/>
+  </w:num>
+  <w:num w:numId="11" w16cid:durableId="1580868092">
+    <w:abstractNumId w:val="48"/>
+  </w:num>
+  <w:num w:numId="12" w16cid:durableId="683748703">
+    <w:abstractNumId w:val="33"/>
+  </w:num>
+  <w:num w:numId="13" w16cid:durableId="1687949645">
+    <w:abstractNumId w:val="36"/>
+  </w:num>
+  <w:num w:numId="14" w16cid:durableId="344014117">
+    <w:abstractNumId w:val="20"/>
+  </w:num>
+  <w:num w:numId="15" w16cid:durableId="2070372122">
+    <w:abstractNumId w:val="9"/>
+  </w:num>
+  <w:num w:numId="16" w16cid:durableId="520970508">
+    <w:abstractNumId w:val="31"/>
+  </w:num>
+  <w:num w:numId="17" w16cid:durableId="1274240974">
+    <w:abstractNumId w:val="22"/>
+  </w:num>
+  <w:num w:numId="18" w16cid:durableId="900336357">
+    <w:abstractNumId w:val="11"/>
+  </w:num>
+  <w:num w:numId="19" w16cid:durableId="1692798447">
+    <w:abstractNumId w:val="26"/>
+  </w:num>
+  <w:num w:numId="20" w16cid:durableId="2045863047">
+    <w:abstractNumId w:val="42"/>
+  </w:num>
+  <w:num w:numId="21" w16cid:durableId="1284263247">
+    <w:abstractNumId w:val="1"/>
+  </w:num>
+  <w:num w:numId="22" w16cid:durableId="810561939">
+    <w:abstractNumId w:val="2"/>
+  </w:num>
+  <w:num w:numId="23" w16cid:durableId="1079446853">
+    <w:abstractNumId w:val="43"/>
+  </w:num>
+  <w:num w:numId="24" w16cid:durableId="225339267">
+    <w:abstractNumId w:val="24"/>
+  </w:num>
+  <w:num w:numId="25" w16cid:durableId="2114085383">
+    <w:abstractNumId w:val="47"/>
+  </w:num>
+  <w:num w:numId="26" w16cid:durableId="949094980">
+    <w:abstractNumId w:val="50"/>
+  </w:num>
+  <w:num w:numId="27" w16cid:durableId="699403589">
+    <w:abstractNumId w:val="17"/>
+  </w:num>
+  <w:num w:numId="28" w16cid:durableId="1536575024">
+    <w:abstractNumId w:val="34"/>
+  </w:num>
+  <w:num w:numId="29" w16cid:durableId="1317299959">
+    <w:abstractNumId w:val="38"/>
+  </w:num>
+  <w:num w:numId="30" w16cid:durableId="586764758">
+    <w:abstractNumId w:val="25"/>
+  </w:num>
+  <w:num w:numId="31" w16cid:durableId="599609915">
+    <w:abstractNumId w:val="44"/>
+  </w:num>
+  <w:num w:numId="32" w16cid:durableId="1952663906">
+    <w:abstractNumId w:val="51"/>
+  </w:num>
+  <w:num w:numId="33" w16cid:durableId="702942103">
+    <w:abstractNumId w:val="32"/>
+  </w:num>
+  <w:num w:numId="34" w16cid:durableId="749428644">
+    <w:abstractNumId w:val="30"/>
+  </w:num>
+  <w:num w:numId="35" w16cid:durableId="1610088802">
+    <w:abstractNumId w:val="28"/>
+  </w:num>
+  <w:num w:numId="36" w16cid:durableId="1683312237">
+    <w:abstractNumId w:val="45"/>
+  </w:num>
+  <w:num w:numId="37" w16cid:durableId="159006337">
+    <w:abstractNumId w:val="40"/>
+  </w:num>
+  <w:num w:numId="38" w16cid:durableId="1277642519">
+    <w:abstractNumId w:val="4"/>
+  </w:num>
+  <w:num w:numId="39" w16cid:durableId="1199124237">
+    <w:abstractNumId w:val="15"/>
+  </w:num>
+  <w:num w:numId="40" w16cid:durableId="2012685312">
+    <w:abstractNumId w:val="27"/>
+  </w:num>
+  <w:num w:numId="41" w16cid:durableId="1362902477">
+    <w:abstractNumId w:val="8"/>
+  </w:num>
+  <w:num w:numId="42" w16cid:durableId="648828760">
+    <w:abstractNumId w:val="5"/>
+  </w:num>
+  <w:num w:numId="43" w16cid:durableId="271209437">
+    <w:abstractNumId w:val="6"/>
+  </w:num>
+  <w:num w:numId="44" w16cid:durableId="988633259">
     <w:abstractNumId w:val="41"/>
   </w:num>
-  <w:num w:numId="2" w16cid:durableId="325256125">
-    <w:abstractNumId w:val="9"/>
+  <w:num w:numId="45" w16cid:durableId="1967150771">
+    <w:abstractNumId w:val="39"/>
   </w:num>
-  <w:num w:numId="3" w16cid:durableId="1961304762">
-    <w:abstractNumId w:val="32"/>
+  <w:num w:numId="46" w16cid:durableId="249387499">
+    <w:abstractNumId w:val="29"/>
   </w:num>
-  <w:num w:numId="4" w16cid:durableId="603266519">
-    <w:abstractNumId w:val="44"/>
+  <w:num w:numId="47" w16cid:durableId="498664782">
+    <w:abstractNumId w:val="16"/>
   </w:num>
-  <w:num w:numId="5" w16cid:durableId="1450708912">
-    <w:abstractNumId w:val="47"/>
+  <w:num w:numId="48" w16cid:durableId="230505632">
+    <w:abstractNumId w:val="7"/>
   </w:num>
-  <w:num w:numId="6" w16cid:durableId="661199120">
+  <w:num w:numId="49" w16cid:durableId="2092658879">
+    <w:abstractNumId w:val="12"/>
+  </w:num>
+  <w:num w:numId="50" w16cid:durableId="2072263690">
+    <w:abstractNumId w:val="0"/>
+  </w:num>
+  <w:num w:numId="51" w16cid:durableId="381297453">
     <w:abstractNumId w:val="14"/>
   </w:num>
-  <w:num w:numId="7" w16cid:durableId="140000110">
-    <w:abstractNumId w:val="15"/>
-  </w:num>
-  <w:num w:numId="8" w16cid:durableId="721950120">
-    <w:abstractNumId w:val="2"/>
-  </w:num>
-  <w:num w:numId="9" w16cid:durableId="993992974">
-    <w:abstractNumId w:val="17"/>
-  </w:num>
-  <w:num w:numId="10" w16cid:durableId="1983341953">
-    <w:abstractNumId w:val="19"/>
-  </w:num>
-  <w:num w:numId="11" w16cid:durableId="1580868092">
-    <w:abstractNumId w:val="43"/>
-  </w:num>
-  <w:num w:numId="12" w16cid:durableId="683748703">
-    <w:abstractNumId w:val="29"/>
-  </w:num>
-  <w:num w:numId="13" w16cid:durableId="1687949645">
-    <w:abstractNumId w:val="31"/>
-  </w:num>
-  <w:num w:numId="14" w16cid:durableId="344014117">
-    <w:abstractNumId w:val="16"/>
-  </w:num>
-  <w:num w:numId="15" w16cid:durableId="2070372122">
-    <w:abstractNumId w:val="8"/>
-  </w:num>
-  <w:num w:numId="16" w16cid:durableId="520970508">
-    <w:abstractNumId w:val="27"/>
-  </w:num>
-  <w:num w:numId="17" w16cid:durableId="1274240974">
-    <w:abstractNumId w:val="18"/>
-  </w:num>
-  <w:num w:numId="18" w16cid:durableId="900336357">
-    <w:abstractNumId w:val="10"/>
-  </w:num>
-  <w:num w:numId="19" w16cid:durableId="1692798447">
-    <w:abstractNumId w:val="22"/>
-  </w:num>
-  <w:num w:numId="20" w16cid:durableId="2045863047">
-    <w:abstractNumId w:val="37"/>
-  </w:num>
-  <w:num w:numId="21" w16cid:durableId="1284263247">
-    <w:abstractNumId w:val="0"/>
-  </w:num>
-  <w:num w:numId="22" w16cid:durableId="810561939">
-    <w:abstractNumId w:val="1"/>
-  </w:num>
-  <w:num w:numId="23" w16cid:durableId="1079446853">
-    <w:abstractNumId w:val="38"/>
-  </w:num>
-  <w:num w:numId="24" w16cid:durableId="225339267">
-    <w:abstractNumId w:val="20"/>
-  </w:num>
-  <w:num w:numId="25" w16cid:durableId="2114085383">
-    <w:abstractNumId w:val="42"/>
-  </w:num>
-  <w:num w:numId="26" w16cid:durableId="949094980">
-    <w:abstractNumId w:val="45"/>
-  </w:num>
-  <w:num w:numId="27" w16cid:durableId="699403589">
-    <w:abstractNumId w:val="13"/>
-  </w:num>
-  <w:num w:numId="28" w16cid:durableId="1536575024">
-    <w:abstractNumId w:val="30"/>
-  </w:num>
-  <w:num w:numId="29" w16cid:durableId="1317299959">
-    <w:abstractNumId w:val="33"/>
-  </w:num>
-  <w:num w:numId="30" w16cid:durableId="586764758">
-    <w:abstractNumId w:val="21"/>
-  </w:num>
-  <w:num w:numId="31" w16cid:durableId="599609915">
-    <w:abstractNumId w:val="39"/>
-  </w:num>
-  <w:num w:numId="32" w16cid:durableId="1952663906">
-    <w:abstractNumId w:val="46"/>
-  </w:num>
-  <w:num w:numId="33" w16cid:durableId="702942103">
-    <w:abstractNumId w:val="28"/>
-  </w:num>
-  <w:num w:numId="34" w16cid:durableId="749428644">
-    <w:abstractNumId w:val="26"/>
-  </w:num>
-  <w:num w:numId="35" w16cid:durableId="1610088802">
-    <w:abstractNumId w:val="24"/>
-  </w:num>
-  <w:num w:numId="36" w16cid:durableId="1683312237">
-    <w:abstractNumId w:val="40"/>
-  </w:num>
-  <w:num w:numId="37" w16cid:durableId="159006337">
+  <w:num w:numId="52" w16cid:durableId="736049458">
     <w:abstractNumId w:val="35"/>
   </w:num>
-  <w:num w:numId="38" w16cid:durableId="1277642519">
-    <w:abstractNumId w:val="3"/>
-  </w:num>
-  <w:num w:numId="39" w16cid:durableId="1199124237">
-    <w:abstractNumId w:val="11"/>
-  </w:num>
-  <w:num w:numId="40" w16cid:durableId="2012685312">
-    <w:abstractNumId w:val="23"/>
-  </w:num>
-  <w:num w:numId="41" w16cid:durableId="1362902477">
-    <w:abstractNumId w:val="7"/>
-  </w:num>
-  <w:num w:numId="42" w16cid:durableId="648828760">
-    <w:abstractNumId w:val="4"/>
-  </w:num>
-  <w:num w:numId="43" w16cid:durableId="271209437">
-    <w:abstractNumId w:val="5"/>
-  </w:num>
-  <w:num w:numId="44" w16cid:durableId="988633259">
-    <w:abstractNumId w:val="36"/>
-  </w:num>
-  <w:num w:numId="45" w16cid:durableId="1967150771">
-    <w:abstractNumId w:val="34"/>
-  </w:num>
-  <w:num w:numId="46" w16cid:durableId="249387499">
-    <w:abstractNumId w:val="25"/>
-  </w:num>
-  <w:num w:numId="47" w16cid:durableId="498664782">
-    <w:abstractNumId w:val="12"/>
-  </w:num>
-  <w:num w:numId="48" w16cid:durableId="230505632">
-    <w:abstractNumId w:val="6"/>
+  <w:num w:numId="53" w16cid:durableId="1089884306">
+    <w:abstractNumId w:val="13"/>
   </w:num>
   <w:numIdMacAtCleanup w:val="48"/>
 </w:numbering>
 </file>
 
 <file path=word/styles.xml><?xml version="1.0" encoding="utf-8"?>
-<w:styles xmlns:mc="http://schemas.openxmlformats.org/markup-compatibility/2006" xmlns:r="http://schemas.openxmlformats.org/officeDocument/2006/relationships" xmlns:w="http://schemas.openxmlformats.org/wordprocessingml/2006/main" xmlns:w14="http://schemas.microsoft.com/office/word/2010/wordml" xmlns:w15="http://schemas.microsoft.com/office/word/2012/wordml" xmlns:w16cex="http://schemas.microsoft.com/office/word/2018/wordml/cex" xmlns:w16cid="http://schemas.microsoft.com/office/word/2016/wordml/cid" xmlns:w16="http://schemas.microsoft.com/office/word/2018/wordml" xmlns:w16sdtdh="http://schemas.microsoft.com/office/word/2020/wordml/sdtdatahash" xmlns:w16se="http://schemas.microsoft.com/office/word/2015/wordml/symex" mc:Ignorable="w14 w15 w16se w16cid w16 w16cex w16sdtdh">
+<w:styles xmlns:mc="http://schemas.openxmlformats.org/markup-compatibility/2006" xmlns:r="http://schemas.openxmlformats.org/officeDocument/2006/relationships" xmlns:w="http://schemas.openxmlformats.org/wordprocessingml/2006/main" xmlns:w14="http://schemas.microsoft.com/office/word/2010/wordml" xmlns:w15="http://schemas.microsoft.com/office/word/2012/wordml" xmlns:w16cex="http://schemas.microsoft.com/office/word/2018/wordml/cex" xmlns:w16cid="http://schemas.microsoft.com/office/word/2016/wordml/cid" xmlns:w16="http://schemas.microsoft.com/office/word/2018/wordml" xmlns:w16du="http://schemas.microsoft.com/office/word/2023/wordml/word16du" xmlns:w16sdtdh="http://schemas.microsoft.com/office/word/2020/wordml/sdtdatahash" xmlns:w16sdtfl="http://schemas.microsoft.com/office/word/2024/wordml/sdtformatlock" xmlns:w16se="http://schemas.microsoft.com/office/word/2015/wordml/symex" mc:Ignorable="w14 w15 w16se w16cid w16 w16cex w16sdtdh w16sdtfl w16du">
   <w:docDefaults>
     <w:rPrDefault>
       <w:rPr>

</xml_diff>